<commit_message>
docs(manual): document two-tier KB + update-all.sh workflow
- New "Knowledge Base — how it's organised" section explaining Tier 1
  (general, local) vs Tier 2 (customer, shared via OneDrive AI-INFO folders),
  which agents use which, and the collaborative notes.md/memory.md pattern.
- New "Updating to the latest version" section covering
  scripts/update-all.sh for existing installations.
- Jump-link for already-installed readers at the top.
- DOCX regenerated via create_ttc_docx.py.

Co-Authored-By: Claude Opus 4.7 (1M context) <noreply@anthropic.com>
</commit_message>
<xml_diff>
--- a/docs/TTC-Agent-Install-Manual.docx
+++ b/docs/TTC-Agent-Install-Manual.docx
@@ -200,6 +200,22 @@
           <w:sz w:val="20"/>
         </w:rPr>
         <w:t>If you get stuck at any step, send a screenshot to Joerg and we will get you unblocked.</w:t>
+      </w:r>
+    </w:p>
+    <w:p>
+      <w:pPr>
+        <w:spacing w:before="80" w:after="80"/>
+        <w:ind w:left="567"/>
+      </w:pPr>
+      <w:r>
+        <w:rPr>
+          <w:rFonts w:ascii="Arial" w:hAnsi="Arial"/>
+          <w:b w:val="0"/>
+          <w:i/>
+          <w:color w:val="005A6C"/>
+          <w:sz w:val="18"/>
+        </w:rPr>
+        <w:t>*Already installed?* Skip to [Updating to the latest version](#updating-to-the-latest-version) — one command and you're current. The [Knowledge Base section](#knowledge-base--how-its-organised) covers the new two-tier (general + shared customer) model.</w:t>
       </w:r>
     </w:p>
     <w:p>
@@ -5087,6 +5103,2662 @@
           <w:sz w:val="20"/>
         </w:rPr>
         <w:t>Once saved, the next time you type `apply personal` in Claude Code the agent picks up your customisations.</w:t>
+      </w:r>
+    </w:p>
+    <w:p>
+      <w:pPr>
+        <w:pStyle w:val="Heading2"/>
+      </w:pPr>
+      <w:r>
+        <w:rPr>
+          <w:rFonts w:ascii="Arial" w:hAnsi="Arial"/>
+          <w:color w:val="005A6C"/>
+          <w:sz w:val="28"/>
+        </w:rPr>
+        <w:t>Knowledge Base — how it's organised</w:t>
+      </w:r>
+    </w:p>
+    <w:p>
+      <w:r>
+        <w:rPr>
+          <w:rFonts w:ascii="Arial" w:hAnsi="Arial"/>
+          <w:b w:val="0"/>
+          <w:i w:val="0"/>
+          <w:color w:val="000000"/>
+          <w:sz w:val="20"/>
+        </w:rPr>
+        <w:t xml:space="preserve">The agents read from </w:t>
+      </w:r>
+      <w:r>
+        <w:rPr>
+          <w:rFonts w:ascii="Arial" w:hAnsi="Arial"/>
+          <w:b/>
+          <w:i w:val="0"/>
+          <w:color w:val="000000"/>
+          <w:sz w:val="20"/>
+        </w:rPr>
+        <w:t>two kinds of knowledge base</w:t>
+      </w:r>
+      <w:r>
+        <w:rPr>
+          <w:rFonts w:ascii="Arial" w:hAnsi="Arial"/>
+          <w:b w:val="0"/>
+          <w:i w:val="0"/>
+          <w:color w:val="000000"/>
+          <w:sz w:val="20"/>
+        </w:rPr>
+        <w:t>. Understanding the split helps you know where to put things and what your colleagues will and won't see.</w:t>
+      </w:r>
+    </w:p>
+    <w:p>
+      <w:pPr>
+        <w:pStyle w:val="Heading3"/>
+      </w:pPr>
+      <w:r>
+        <w:rPr>
+          <w:rFonts w:ascii="Arial" w:hAnsi="Arial"/>
+          <w:color w:val="25415C"/>
+          <w:sz w:val="24"/>
+        </w:rPr>
+        <w:t>Tier 1 — General KB (local, private to you)</w:t>
+      </w:r>
+    </w:p>
+    <w:p>
+      <w:r>
+        <w:rPr>
+          <w:rFonts w:ascii="Arial" w:hAnsi="Arial"/>
+          <w:b w:val="0"/>
+          <w:i w:val="0"/>
+          <w:color w:val="000000"/>
+          <w:sz w:val="20"/>
+        </w:rPr>
+        <w:t>Location: `~/AI-Vault/Claude Folder/Knowledge Base/`</w:t>
+      </w:r>
+    </w:p>
+    <w:p>
+      <w:r>
+        <w:rPr>
+          <w:rFonts w:ascii="Arial" w:hAnsi="Arial"/>
+          <w:b w:val="0"/>
+          <w:i w:val="0"/>
+          <w:color w:val="000000"/>
+          <w:sz w:val="20"/>
+        </w:rPr>
+        <w:t>Contains TTC-internal reference material that every installation keeps its own copy of:</w:t>
+      </w:r>
+    </w:p>
+    <w:tbl>
+      <w:tblPr>
+        <w:tblStyle w:val="TableGrid"/>
+        <w:tblW w:type="auto" w:w="0"/>
+        <w:jc w:val="left"/>
+        <w:tblLook w:firstColumn="1" w:firstRow="1" w:lastColumn="0" w:lastRow="0" w:noHBand="0" w:noVBand="1" w:val="04A0"/>
+      </w:tblPr>
+      <w:tblGrid>
+        <w:gridCol w:w="4536"/>
+        <w:gridCol w:w="4536"/>
+      </w:tblGrid>
+      <w:tr>
+        <w:tc>
+          <w:tcPr>
+            <w:tcW w:type="dxa" w:w="4536"/>
+            <w:shd w:val="clear" w:color="auto" w:fill="25415C"/>
+            <w:tcMar>
+              <w:top w:w="50" w:type="dxa"/>
+              <w:bottom w:w="50" w:type="dxa"/>
+              <w:start w:w="80" w:type="dxa"/>
+              <w:end w:w="80" w:type="dxa"/>
+            </w:tcMar>
+            <w:vAlign w:val="center"/>
+          </w:tcPr>
+          <w:p>
+            <w:r/>
+            <w:r>
+              <w:rPr>
+                <w:rFonts w:ascii="Arial" w:hAnsi="Arial"/>
+                <w:b/>
+                <w:i w:val="0"/>
+                <w:color w:val="FFFFFF"/>
+                <w:sz w:val="18"/>
+              </w:rPr>
+              <w:t>Folder</w:t>
+            </w:r>
+          </w:p>
+        </w:tc>
+        <w:tc>
+          <w:tcPr>
+            <w:tcW w:type="dxa" w:w="4536"/>
+            <w:shd w:val="clear" w:color="auto" w:fill="25415C"/>
+            <w:tcMar>
+              <w:top w:w="50" w:type="dxa"/>
+              <w:bottom w:w="50" w:type="dxa"/>
+              <w:start w:w="80" w:type="dxa"/>
+              <w:end w:w="80" w:type="dxa"/>
+            </w:tcMar>
+            <w:vAlign w:val="center"/>
+          </w:tcPr>
+          <w:p>
+            <w:r/>
+            <w:r>
+              <w:rPr>
+                <w:rFonts w:ascii="Arial" w:hAnsi="Arial"/>
+                <w:b/>
+                <w:i w:val="0"/>
+                <w:color w:val="FFFFFF"/>
+                <w:sz w:val="18"/>
+              </w:rPr>
+              <w:t>What's in it</w:t>
+            </w:r>
+          </w:p>
+        </w:tc>
+      </w:tr>
+      <w:tr>
+        <w:tc>
+          <w:tcPr>
+            <w:tcW w:type="dxa" w:w="4536"/>
+            <w:tcMar>
+              <w:top w:w="50" w:type="dxa"/>
+              <w:bottom w:w="50" w:type="dxa"/>
+              <w:start w:w="80" w:type="dxa"/>
+              <w:end w:w="80" w:type="dxa"/>
+            </w:tcMar>
+            <w:vAlign w:val="center"/>
+          </w:tcPr>
+          <w:p>
+            <w:r/>
+            <w:r>
+              <w:rPr>
+                <w:rFonts w:ascii="Arial" w:hAnsi="Arial"/>
+                <w:b w:val="0"/>
+                <w:i w:val="0"/>
+                <w:color w:val="000000"/>
+                <w:sz w:val="18"/>
+              </w:rPr>
+              <w:t>`BwBm/`</w:t>
+            </w:r>
+          </w:p>
+        </w:tc>
+        <w:tc>
+          <w:tcPr>
+            <w:tcW w:type="dxa" w:w="4536"/>
+            <w:tcMar>
+              <w:top w:w="50" w:type="dxa"/>
+              <w:bottom w:w="50" w:type="dxa"/>
+              <w:start w:w="80" w:type="dxa"/>
+              <w:end w:w="80" w:type="dxa"/>
+            </w:tcMar>
+            <w:vAlign w:val="center"/>
+          </w:tcPr>
+          <w:p>
+            <w:r/>
+            <w:r>
+              <w:rPr>
+                <w:rFonts w:ascii="Arial" w:hAnsi="Arial"/>
+                <w:b w:val="0"/>
+                <w:i w:val="0"/>
+                <w:color w:val="000000"/>
+                <w:sz w:val="18"/>
+              </w:rPr>
+              <w:t>Bundeswehr SAP programme (restricted — only if you have bwbm agent access)</w:t>
+            </w:r>
+          </w:p>
+        </w:tc>
+      </w:tr>
+      <w:tr>
+        <w:tc>
+          <w:tcPr>
+            <w:tcW w:type="dxa" w:w="4536"/>
+            <w:tcMar>
+              <w:top w:w="50" w:type="dxa"/>
+              <w:bottom w:w="50" w:type="dxa"/>
+              <w:start w:w="80" w:type="dxa"/>
+              <w:end w:w="80" w:type="dxa"/>
+            </w:tcMar>
+            <w:shd w:val="clear" w:color="auto" w:fill="E9EDF0"/>
+            <w:vAlign w:val="center"/>
+          </w:tcPr>
+          <w:p>
+            <w:r/>
+            <w:r>
+              <w:rPr>
+                <w:rFonts w:ascii="Arial" w:hAnsi="Arial"/>
+                <w:b w:val="0"/>
+                <w:i w:val="0"/>
+                <w:color w:val="000000"/>
+                <w:sz w:val="18"/>
+              </w:rPr>
+              <w:t>`Finance/`</w:t>
+            </w:r>
+          </w:p>
+        </w:tc>
+        <w:tc>
+          <w:tcPr>
+            <w:tcW w:type="dxa" w:w="4536"/>
+            <w:tcMar>
+              <w:top w:w="50" w:type="dxa"/>
+              <w:bottom w:w="50" w:type="dxa"/>
+              <w:start w:w="80" w:type="dxa"/>
+              <w:end w:w="80" w:type="dxa"/>
+            </w:tcMar>
+            <w:shd w:val="clear" w:color="auto" w:fill="E9EDF0"/>
+            <w:vAlign w:val="center"/>
+          </w:tcPr>
+          <w:p>
+            <w:r/>
+            <w:r>
+              <w:rPr>
+                <w:rFonts w:ascii="Arial" w:hAnsi="Arial"/>
+                <w:b w:val="0"/>
+                <w:i w:val="0"/>
+                <w:color w:val="000000"/>
+                <w:sz w:val="18"/>
+              </w:rPr>
+              <w:t>TTC contract templates, pricing baselines, partner agreements</w:t>
+            </w:r>
+          </w:p>
+        </w:tc>
+      </w:tr>
+      <w:tr>
+        <w:tc>
+          <w:tcPr>
+            <w:tcW w:type="dxa" w:w="4536"/>
+            <w:tcMar>
+              <w:top w:w="50" w:type="dxa"/>
+              <w:bottom w:w="50" w:type="dxa"/>
+              <w:start w:w="80" w:type="dxa"/>
+              <w:end w:w="80" w:type="dxa"/>
+            </w:tcMar>
+            <w:vAlign w:val="center"/>
+          </w:tcPr>
+          <w:p>
+            <w:r/>
+            <w:r>
+              <w:rPr>
+                <w:rFonts w:ascii="Arial" w:hAnsi="Arial"/>
+                <w:b w:val="0"/>
+                <w:i w:val="0"/>
+                <w:color w:val="000000"/>
+                <w:sz w:val="18"/>
+              </w:rPr>
+              <w:t>`Personal/`</w:t>
+            </w:r>
+          </w:p>
+        </w:tc>
+        <w:tc>
+          <w:tcPr>
+            <w:tcW w:type="dxa" w:w="4536"/>
+            <w:tcMar>
+              <w:top w:w="50" w:type="dxa"/>
+              <w:bottom w:w="50" w:type="dxa"/>
+              <w:start w:w="80" w:type="dxa"/>
+              <w:end w:w="80" w:type="dxa"/>
+            </w:tcMar>
+            <w:vAlign w:val="center"/>
+          </w:tcPr>
+          <w:p>
+            <w:r/>
+            <w:r>
+              <w:rPr>
+                <w:rFonts w:ascii="Arial" w:hAnsi="Arial"/>
+                <w:b w:val="0"/>
+                <w:i w:val="0"/>
+                <w:color w:val="000000"/>
+                <w:sz w:val="18"/>
+              </w:rPr>
+              <w:t>Your own personal notes</w:t>
+            </w:r>
+          </w:p>
+        </w:tc>
+      </w:tr>
+      <w:tr>
+        <w:tc>
+          <w:tcPr>
+            <w:tcW w:type="dxa" w:w="4536"/>
+            <w:tcMar>
+              <w:top w:w="50" w:type="dxa"/>
+              <w:bottom w:w="50" w:type="dxa"/>
+              <w:start w:w="80" w:type="dxa"/>
+              <w:end w:w="80" w:type="dxa"/>
+            </w:tcMar>
+            <w:shd w:val="clear" w:color="auto" w:fill="E9EDF0"/>
+            <w:vAlign w:val="center"/>
+          </w:tcPr>
+          <w:p>
+            <w:r/>
+            <w:r>
+              <w:rPr>
+                <w:rFonts w:ascii="Arial" w:hAnsi="Arial"/>
+                <w:b w:val="0"/>
+                <w:i w:val="0"/>
+                <w:color w:val="000000"/>
+                <w:sz w:val="18"/>
+              </w:rPr>
+              <w:t>`ttc-general/`</w:t>
+            </w:r>
+          </w:p>
+        </w:tc>
+        <w:tc>
+          <w:tcPr>
+            <w:tcW w:type="dxa" w:w="4536"/>
+            <w:tcMar>
+              <w:top w:w="50" w:type="dxa"/>
+              <w:bottom w:w="50" w:type="dxa"/>
+              <w:start w:w="80" w:type="dxa"/>
+              <w:end w:w="80" w:type="dxa"/>
+            </w:tcMar>
+            <w:shd w:val="clear" w:color="auto" w:fill="E9EDF0"/>
+            <w:vAlign w:val="center"/>
+          </w:tcPr>
+          <w:p>
+            <w:r/>
+            <w:r>
+              <w:rPr>
+                <w:rFonts w:ascii="Arial" w:hAnsi="Arial"/>
+                <w:b w:val="0"/>
+                <w:i w:val="0"/>
+                <w:color w:val="000000"/>
+                <w:sz w:val="18"/>
+              </w:rPr>
+              <w:t>Brand assets, sales methodology, service offerings</w:t>
+            </w:r>
+          </w:p>
+        </w:tc>
+      </w:tr>
+      <w:tr>
+        <w:tc>
+          <w:tcPr>
+            <w:tcW w:type="dxa" w:w="4536"/>
+            <w:tcMar>
+              <w:top w:w="50" w:type="dxa"/>
+              <w:bottom w:w="50" w:type="dxa"/>
+              <w:start w:w="80" w:type="dxa"/>
+              <w:end w:w="80" w:type="dxa"/>
+            </w:tcMar>
+            <w:vAlign w:val="center"/>
+          </w:tcPr>
+          <w:p>
+            <w:r/>
+            <w:r>
+              <w:rPr>
+                <w:rFonts w:ascii="Arial" w:hAnsi="Arial"/>
+                <w:b w:val="0"/>
+                <w:i w:val="0"/>
+                <w:color w:val="000000"/>
+                <w:sz w:val="18"/>
+              </w:rPr>
+              <w:t>`Archive/`</w:t>
+            </w:r>
+          </w:p>
+        </w:tc>
+        <w:tc>
+          <w:tcPr>
+            <w:tcW w:type="dxa" w:w="4536"/>
+            <w:tcMar>
+              <w:top w:w="50" w:type="dxa"/>
+              <w:bottom w:w="50" w:type="dxa"/>
+              <w:start w:w="80" w:type="dxa"/>
+              <w:end w:w="80" w:type="dxa"/>
+            </w:tcMar>
+            <w:vAlign w:val="center"/>
+          </w:tcPr>
+          <w:p>
+            <w:r/>
+            <w:r>
+              <w:rPr>
+                <w:rFonts w:ascii="Arial" w:hAnsi="Arial"/>
+                <w:b w:val="0"/>
+                <w:i w:val="0"/>
+                <w:color w:val="000000"/>
+                <w:sz w:val="18"/>
+              </w:rPr>
+              <w:t>Historical, read-only</w:t>
+            </w:r>
+          </w:p>
+        </w:tc>
+      </w:tr>
+    </w:tbl>
+    <w:p/>
+    <w:p>
+      <w:r>
+        <w:rPr>
+          <w:rFonts w:ascii="Arial" w:hAnsi="Arial"/>
+          <w:b w:val="0"/>
+          <w:i w:val="0"/>
+          <w:color w:val="000000"/>
+          <w:sz w:val="20"/>
+        </w:rPr>
+        <w:t xml:space="preserve">This tier is </w:t>
+      </w:r>
+      <w:r>
+        <w:rPr>
+          <w:rFonts w:ascii="Arial" w:hAnsi="Arial"/>
+          <w:b/>
+          <w:i w:val="0"/>
+          <w:color w:val="000000"/>
+          <w:sz w:val="20"/>
+        </w:rPr>
+        <w:t>local to your machine</w:t>
+      </w:r>
+      <w:r>
+        <w:rPr>
+          <w:rFonts w:ascii="Arial" w:hAnsi="Arial"/>
+          <w:b w:val="0"/>
+          <w:i w:val="0"/>
+          <w:color w:val="000000"/>
+          <w:sz w:val="20"/>
+        </w:rPr>
+        <w:t>. Your colleagues have their own copies. Refreshing one doesn't touch anyone else's.</w:t>
+      </w:r>
+    </w:p>
+    <w:p>
+      <w:pPr>
+        <w:pStyle w:val="Heading3"/>
+      </w:pPr>
+      <w:r>
+        <w:rPr>
+          <w:rFonts w:ascii="Arial" w:hAnsi="Arial"/>
+          <w:color w:val="25415C"/>
+          <w:sz w:val="24"/>
+        </w:rPr>
+        <w:t>Tier 2 — Customer KB (shared via OneDrive)</w:t>
+      </w:r>
+    </w:p>
+    <w:p>
+      <w:r>
+        <w:rPr>
+          <w:rFonts w:ascii="Arial" w:hAnsi="Arial"/>
+          <w:b w:val="0"/>
+          <w:i w:val="0"/>
+          <w:color w:val="000000"/>
+          <w:sz w:val="20"/>
+        </w:rPr>
+        <w:t>Location: every active customer has a hidden folder called `AI-INFO - DO NOT DELETE/` directly under their OneDrive folder. Examples:</w:t>
+      </w:r>
+    </w:p>
+    <w:p>
+      <w:pPr>
+        <w:spacing w:before="120" w:after="120"/>
+        <w:ind w:left="567"/>
+        <w:shd w:val="clear" w:color="auto" w:fill="E9EDF0"/>
+      </w:pPr>
+      <w:r>
+        <w:rPr>
+          <w:rFonts w:ascii="Courier New" w:hAnsi="Courier New"/>
+          <w:color w:val="25415C"/>
+          <w:sz w:val="16"/>
+        </w:rPr>
+        <w:t>OneDrive-TTCGlobal/Sales/Customer/Middle East/ADNOC/AI-INFO - DO NOT DELETE/</w:t>
+      </w:r>
+      <w:r>
+        <w:rPr>
+          <w:rFonts w:ascii="Courier New" w:hAnsi="Courier New"/>
+          <w:color w:val="25415C"/>
+          <w:sz w:val="16"/>
+        </w:rPr>
+        <w:br/>
+        <w:t>OneDrive-TTCGlobal/Sales/Customer/Middle East/ENOC/AI-INFO - DO NOT DELETE/</w:t>
+      </w:r>
+      <w:r>
+        <w:rPr>
+          <w:rFonts w:ascii="Courier New" w:hAnsi="Courier New"/>
+          <w:color w:val="25415C"/>
+          <w:sz w:val="16"/>
+        </w:rPr>
+        <w:br/>
+        <w:t>OneDrive-TTCGlobal/Delivery/Leapwork/VKB/AI-INFO - DO NOT DELETE/</w:t>
+      </w:r>
+    </w:p>
+    <w:p>
+      <w:r>
+        <w:rPr>
+          <w:rFonts w:ascii="Arial" w:hAnsi="Arial"/>
+          <w:b w:val="0"/>
+          <w:i w:val="0"/>
+          <w:color w:val="000000"/>
+          <w:sz w:val="20"/>
+        </w:rPr>
+        <w:t>Inside each folder:</w:t>
+      </w:r>
+    </w:p>
+    <w:tbl>
+      <w:tblPr>
+        <w:tblStyle w:val="TableGrid"/>
+        <w:tblW w:type="auto" w:w="0"/>
+        <w:jc w:val="left"/>
+        <w:tblLook w:firstColumn="1" w:firstRow="1" w:lastColumn="0" w:lastRow="0" w:noHBand="0" w:noVBand="1" w:val="04A0"/>
+      </w:tblPr>
+      <w:tblGrid>
+        <w:gridCol w:w="4536"/>
+        <w:gridCol w:w="4536"/>
+      </w:tblGrid>
+      <w:tr>
+        <w:tc>
+          <w:tcPr>
+            <w:tcW w:type="dxa" w:w="4536"/>
+            <w:shd w:val="clear" w:color="auto" w:fill="25415C"/>
+            <w:tcMar>
+              <w:top w:w="50" w:type="dxa"/>
+              <w:bottom w:w="50" w:type="dxa"/>
+              <w:start w:w="80" w:type="dxa"/>
+              <w:end w:w="80" w:type="dxa"/>
+            </w:tcMar>
+            <w:vAlign w:val="center"/>
+          </w:tcPr>
+          <w:p>
+            <w:r/>
+            <w:r>
+              <w:rPr>
+                <w:rFonts w:ascii="Arial" w:hAnsi="Arial"/>
+                <w:b/>
+                <w:i w:val="0"/>
+                <w:color w:val="FFFFFF"/>
+                <w:sz w:val="18"/>
+              </w:rPr>
+              <w:t>File / folder</w:t>
+            </w:r>
+          </w:p>
+        </w:tc>
+        <w:tc>
+          <w:tcPr>
+            <w:tcW w:type="dxa" w:w="4536"/>
+            <w:shd w:val="clear" w:color="auto" w:fill="25415C"/>
+            <w:tcMar>
+              <w:top w:w="50" w:type="dxa"/>
+              <w:bottom w:w="50" w:type="dxa"/>
+              <w:start w:w="80" w:type="dxa"/>
+              <w:end w:w="80" w:type="dxa"/>
+            </w:tcMar>
+            <w:vAlign w:val="center"/>
+          </w:tcPr>
+          <w:p>
+            <w:r/>
+            <w:r>
+              <w:rPr>
+                <w:rFonts w:ascii="Arial" w:hAnsi="Arial"/>
+                <w:b/>
+                <w:i w:val="0"/>
+                <w:color w:val="FFFFFF"/>
+                <w:sz w:val="18"/>
+              </w:rPr>
+              <w:t>Purpose</w:t>
+            </w:r>
+          </w:p>
+        </w:tc>
+      </w:tr>
+      <w:tr>
+        <w:tc>
+          <w:tcPr>
+            <w:tcW w:type="dxa" w:w="4536"/>
+            <w:tcMar>
+              <w:top w:w="50" w:type="dxa"/>
+              <w:bottom w:w="50" w:type="dxa"/>
+              <w:start w:w="80" w:type="dxa"/>
+              <w:end w:w="80" w:type="dxa"/>
+            </w:tcMar>
+            <w:vAlign w:val="center"/>
+          </w:tcPr>
+          <w:p>
+            <w:r/>
+            <w:r>
+              <w:rPr>
+                <w:rFonts w:ascii="Arial" w:hAnsi="Arial"/>
+                <w:b w:val="0"/>
+                <w:i w:val="0"/>
+                <w:color w:val="000000"/>
+                <w:sz w:val="18"/>
+              </w:rPr>
+              <w:t>`README.md`</w:t>
+            </w:r>
+          </w:p>
+        </w:tc>
+        <w:tc>
+          <w:tcPr>
+            <w:tcW w:type="dxa" w:w="4536"/>
+            <w:tcMar>
+              <w:top w:w="50" w:type="dxa"/>
+              <w:bottom w:w="50" w:type="dxa"/>
+              <w:start w:w="80" w:type="dxa"/>
+              <w:end w:w="80" w:type="dxa"/>
+            </w:tcMar>
+            <w:vAlign w:val="center"/>
+          </w:tcPr>
+          <w:p>
+            <w:r/>
+            <w:r>
+              <w:rPr>
+                <w:rFonts w:ascii="Arial" w:hAnsi="Arial"/>
+                <w:b w:val="0"/>
+                <w:i w:val="0"/>
+                <w:color w:val="000000"/>
+                <w:sz w:val="18"/>
+              </w:rPr>
+              <w:t>Explains rules, names the responsible owner</w:t>
+            </w:r>
+          </w:p>
+        </w:tc>
+      </w:tr>
+      <w:tr>
+        <w:tc>
+          <w:tcPr>
+            <w:tcW w:type="dxa" w:w="4536"/>
+            <w:tcMar>
+              <w:top w:w="50" w:type="dxa"/>
+              <w:bottom w:w="50" w:type="dxa"/>
+              <w:start w:w="80" w:type="dxa"/>
+              <w:end w:w="80" w:type="dxa"/>
+            </w:tcMar>
+            <w:shd w:val="clear" w:color="auto" w:fill="E9EDF0"/>
+            <w:vAlign w:val="center"/>
+          </w:tcPr>
+          <w:p>
+            <w:r/>
+            <w:r>
+              <w:rPr>
+                <w:rFonts w:ascii="Arial" w:hAnsi="Arial"/>
+                <w:b w:val="0"/>
+                <w:i w:val="0"/>
+                <w:color w:val="000000"/>
+                <w:sz w:val="18"/>
+              </w:rPr>
+              <w:t>`notes.md`</w:t>
+            </w:r>
+          </w:p>
+        </w:tc>
+        <w:tc>
+          <w:tcPr>
+            <w:tcW w:type="dxa" w:w="4536"/>
+            <w:tcMar>
+              <w:top w:w="50" w:type="dxa"/>
+              <w:bottom w:w="50" w:type="dxa"/>
+              <w:start w:w="80" w:type="dxa"/>
+              <w:end w:w="80" w:type="dxa"/>
+            </w:tcMar>
+            <w:shd w:val="clear" w:color="auto" w:fill="E9EDF0"/>
+            <w:vAlign w:val="center"/>
+          </w:tcPr>
+          <w:p>
+            <w:r/>
+            <w:r>
+              <w:rPr>
+                <w:rFonts w:ascii="Arial" w:hAnsi="Arial"/>
+                <w:b w:val="0"/>
+                <w:i w:val="0"/>
+                <w:color w:val="000000"/>
+                <w:sz w:val="18"/>
+              </w:rPr>
+              <w:t>**Human-editable** running notes on the customer — anyone with folder access can contribute</w:t>
+            </w:r>
+          </w:p>
+        </w:tc>
+      </w:tr>
+      <w:tr>
+        <w:tc>
+          <w:tcPr>
+            <w:tcW w:type="dxa" w:w="4536"/>
+            <w:tcMar>
+              <w:top w:w="50" w:type="dxa"/>
+              <w:bottom w:w="50" w:type="dxa"/>
+              <w:start w:w="80" w:type="dxa"/>
+              <w:end w:w="80" w:type="dxa"/>
+            </w:tcMar>
+            <w:vAlign w:val="center"/>
+          </w:tcPr>
+          <w:p>
+            <w:r/>
+            <w:r>
+              <w:rPr>
+                <w:rFonts w:ascii="Arial" w:hAnsi="Arial"/>
+                <w:b w:val="0"/>
+                <w:i w:val="0"/>
+                <w:color w:val="000000"/>
+                <w:sz w:val="18"/>
+              </w:rPr>
+              <w:t>`memory.md`</w:t>
+            </w:r>
+          </w:p>
+        </w:tc>
+        <w:tc>
+          <w:tcPr>
+            <w:tcW w:type="dxa" w:w="4536"/>
+            <w:tcMar>
+              <w:top w:w="50" w:type="dxa"/>
+              <w:bottom w:w="50" w:type="dxa"/>
+              <w:start w:w="80" w:type="dxa"/>
+              <w:end w:w="80" w:type="dxa"/>
+            </w:tcMar>
+            <w:vAlign w:val="center"/>
+          </w:tcPr>
+          <w:p>
+            <w:r/>
+            <w:r>
+              <w:rPr>
+                <w:rFonts w:ascii="Arial" w:hAnsi="Arial"/>
+                <w:b w:val="0"/>
+                <w:i w:val="0"/>
+                <w:color w:val="000000"/>
+                <w:sz w:val="18"/>
+              </w:rPr>
+              <w:t>Agent session highlights — what AI has learned or decided</w:t>
+            </w:r>
+          </w:p>
+        </w:tc>
+      </w:tr>
+      <w:tr>
+        <w:tc>
+          <w:tcPr>
+            <w:tcW w:type="dxa" w:w="4536"/>
+            <w:tcMar>
+              <w:top w:w="50" w:type="dxa"/>
+              <w:bottom w:w="50" w:type="dxa"/>
+              <w:start w:w="80" w:type="dxa"/>
+              <w:end w:w="80" w:type="dxa"/>
+            </w:tcMar>
+            <w:shd w:val="clear" w:color="auto" w:fill="E9EDF0"/>
+            <w:vAlign w:val="center"/>
+          </w:tcPr>
+          <w:p>
+            <w:r/>
+            <w:r>
+              <w:rPr>
+                <w:rFonts w:ascii="Arial" w:hAnsi="Arial"/>
+                <w:b w:val="0"/>
+                <w:i w:val="0"/>
+                <w:color w:val="000000"/>
+                <w:sz w:val="18"/>
+              </w:rPr>
+              <w:t>`converted/`</w:t>
+            </w:r>
+          </w:p>
+        </w:tc>
+        <w:tc>
+          <w:tcPr>
+            <w:tcW w:type="dxa" w:w="4536"/>
+            <w:tcMar>
+              <w:top w:w="50" w:type="dxa"/>
+              <w:bottom w:w="50" w:type="dxa"/>
+              <w:start w:w="80" w:type="dxa"/>
+              <w:end w:w="80" w:type="dxa"/>
+            </w:tcMar>
+            <w:shd w:val="clear" w:color="auto" w:fill="E9EDF0"/>
+            <w:vAlign w:val="center"/>
+          </w:tcPr>
+          <w:p>
+            <w:r/>
+            <w:r>
+              <w:rPr>
+                <w:rFonts w:ascii="Arial" w:hAnsi="Arial"/>
+                <w:b w:val="0"/>
+                <w:i w:val="0"/>
+                <w:color w:val="000000"/>
+                <w:sz w:val="18"/>
+              </w:rPr>
+              <w:t>Generated `.txt` files agents read for semantic search — don't edit by hand</w:t>
+            </w:r>
+          </w:p>
+        </w:tc>
+      </w:tr>
+      <w:tr>
+        <w:tc>
+          <w:tcPr>
+            <w:tcW w:type="dxa" w:w="4536"/>
+            <w:tcMar>
+              <w:top w:w="50" w:type="dxa"/>
+              <w:bottom w:w="50" w:type="dxa"/>
+              <w:start w:w="80" w:type="dxa"/>
+              <w:end w:w="80" w:type="dxa"/>
+            </w:tcMar>
+            <w:vAlign w:val="center"/>
+          </w:tcPr>
+          <w:p>
+            <w:r/>
+            <w:r>
+              <w:rPr>
+                <w:rFonts w:ascii="Arial" w:hAnsi="Arial"/>
+                <w:b w:val="0"/>
+                <w:i w:val="0"/>
+                <w:color w:val="000000"/>
+                <w:sz w:val="18"/>
+              </w:rPr>
+              <w:t>`_index.json`</w:t>
+            </w:r>
+          </w:p>
+        </w:tc>
+        <w:tc>
+          <w:tcPr>
+            <w:tcW w:type="dxa" w:w="4536"/>
+            <w:tcMar>
+              <w:top w:w="50" w:type="dxa"/>
+              <w:bottom w:w="50" w:type="dxa"/>
+              <w:start w:w="80" w:type="dxa"/>
+              <w:end w:w="80" w:type="dxa"/>
+            </w:tcMar>
+            <w:vAlign w:val="center"/>
+          </w:tcPr>
+          <w:p>
+            <w:r/>
+            <w:r>
+              <w:rPr>
+                <w:rFonts w:ascii="Arial" w:hAnsi="Arial"/>
+                <w:b w:val="0"/>
+                <w:i w:val="0"/>
+                <w:color w:val="000000"/>
+                <w:sz w:val="18"/>
+              </w:rPr>
+              <w:t>Delta manifest (auto-generated)</w:t>
+            </w:r>
+          </w:p>
+        </w:tc>
+      </w:tr>
+    </w:tbl>
+    <w:p/>
+    <w:p>
+      <w:r>
+        <w:rPr>
+          <w:rFonts w:ascii="Arial" w:hAnsi="Arial"/>
+          <w:b w:val="0"/>
+          <w:i w:val="0"/>
+          <w:color w:val="000000"/>
+          <w:sz w:val="20"/>
+        </w:rPr>
+      </w:r>
+      <w:r>
+        <w:rPr>
+          <w:rFonts w:ascii="Arial" w:hAnsi="Arial"/>
+          <w:b/>
+          <w:i w:val="0"/>
+          <w:color w:val="000000"/>
+          <w:sz w:val="20"/>
+        </w:rPr>
+        <w:t>Why this matters:</w:t>
+      </w:r>
+      <w:r>
+        <w:rPr>
+          <w:rFonts w:ascii="Arial" w:hAnsi="Arial"/>
+          <w:b w:val="0"/>
+          <w:i w:val="0"/>
+          <w:color w:val="000000"/>
+          <w:sz w:val="20"/>
+        </w:rPr>
+      </w:r>
+    </w:p>
+    <w:p>
+      <w:pPr>
+        <w:pStyle w:val="ListBullet"/>
+      </w:pPr>
+      <w:r>
+        <w:rPr>
+          <w:rFonts w:ascii="Arial" w:hAnsi="Arial"/>
+          <w:b w:val="0"/>
+          <w:i w:val="0"/>
+          <w:color w:val="000000"/>
+          <w:sz w:val="20"/>
+        </w:rPr>
+      </w:r>
+      <w:r>
+        <w:rPr>
+          <w:rFonts w:ascii="Arial" w:hAnsi="Arial"/>
+          <w:b/>
+          <w:i w:val="0"/>
+          <w:color w:val="000000"/>
+          <w:sz w:val="20"/>
+        </w:rPr>
+        <w:t>Multi-user collaboration</w:t>
+      </w:r>
+      <w:r>
+        <w:rPr>
+          <w:rFonts w:ascii="Arial" w:hAnsi="Arial"/>
+          <w:b w:val="0"/>
+          <w:i w:val="0"/>
+          <w:color w:val="000000"/>
+          <w:sz w:val="20"/>
+        </w:rPr>
+        <w:t xml:space="preserve"> — when you work on ADNOC, your agent picks up notes your colleague added last week. When you add something, it syncs to them via OneDrive.</w:t>
+      </w:r>
+    </w:p>
+    <w:p>
+      <w:pPr>
+        <w:pStyle w:val="ListBullet"/>
+      </w:pPr>
+      <w:r>
+        <w:rPr>
+          <w:rFonts w:ascii="Arial" w:hAnsi="Arial"/>
+          <w:b w:val="0"/>
+          <w:i w:val="0"/>
+          <w:color w:val="000000"/>
+          <w:sz w:val="20"/>
+        </w:rPr>
+      </w:r>
+      <w:r>
+        <w:rPr>
+          <w:rFonts w:ascii="Arial" w:hAnsi="Arial"/>
+          <w:b/>
+          <w:i w:val="0"/>
+          <w:color w:val="000000"/>
+          <w:sz w:val="20"/>
+        </w:rPr>
+        <w:t>One source of truth per customer</w:t>
+      </w:r>
+      <w:r>
+        <w:rPr>
+          <w:rFonts w:ascii="Arial" w:hAnsi="Arial"/>
+          <w:b w:val="0"/>
+          <w:i w:val="0"/>
+          <w:color w:val="000000"/>
+          <w:sz w:val="20"/>
+        </w:rPr>
+        <w:t xml:space="preserve"> — no more duplicate customer KBs on different machines.</w:t>
+      </w:r>
+    </w:p>
+    <w:p>
+      <w:pPr>
+        <w:pStyle w:val="ListBullet"/>
+      </w:pPr>
+      <w:r>
+        <w:rPr>
+          <w:rFonts w:ascii="Arial" w:hAnsi="Arial"/>
+          <w:b w:val="0"/>
+          <w:i w:val="0"/>
+          <w:color w:val="000000"/>
+          <w:sz w:val="20"/>
+        </w:rPr>
+      </w:r>
+      <w:r>
+        <w:rPr>
+          <w:rFonts w:ascii="Arial" w:hAnsi="Arial"/>
+          <w:b/>
+          <w:i w:val="0"/>
+          <w:color w:val="000000"/>
+          <w:sz w:val="20"/>
+        </w:rPr>
+        <w:t>Folder is hidden</w:t>
+      </w:r>
+      <w:r>
+        <w:rPr>
+          <w:rFonts w:ascii="Arial" w:hAnsi="Arial"/>
+          <w:b w:val="0"/>
+          <w:i w:val="0"/>
+          <w:color w:val="000000"/>
+          <w:sz w:val="20"/>
+        </w:rPr>
+        <w:t xml:space="preserve"> on macOS / Windows — press `Cmd+Shift+.` (Mac) or enable "Show hidden items" (Windows) to see it. OneDrive Web always shows it.</w:t>
+      </w:r>
+    </w:p>
+    <w:p>
+      <w:pPr>
+        <w:pStyle w:val="ListBullet"/>
+      </w:pPr>
+      <w:r>
+        <w:rPr>
+          <w:rFonts w:ascii="Arial" w:hAnsi="Arial"/>
+          <w:b w:val="0"/>
+          <w:i w:val="0"/>
+          <w:color w:val="000000"/>
+          <w:sz w:val="20"/>
+        </w:rPr>
+      </w:r>
+      <w:r>
+        <w:rPr>
+          <w:rFonts w:ascii="Arial" w:hAnsi="Arial"/>
+          <w:b/>
+          <w:i w:val="0"/>
+          <w:color w:val="000000"/>
+          <w:sz w:val="20"/>
+        </w:rPr>
+        <w:t>Name is deliberately awkward</w:t>
+      </w:r>
+      <w:r>
+        <w:rPr>
+          <w:rFonts w:ascii="Arial" w:hAnsi="Arial"/>
+          <w:b w:val="0"/>
+          <w:i w:val="0"/>
+          <w:color w:val="000000"/>
+          <w:sz w:val="20"/>
+        </w:rPr>
+        <w:t xml:space="preserve"> (`AI-INFO - DO NOT DELETE`) so no one mistakes it for deliverables. OneDrive restores deletions within 93 days anyway.</w:t>
+      </w:r>
+    </w:p>
+    <w:p>
+      <w:pPr>
+        <w:pStyle w:val="Heading3"/>
+      </w:pPr>
+      <w:r>
+        <w:rPr>
+          <w:rFonts w:ascii="Arial" w:hAnsi="Arial"/>
+          <w:color w:val="25415C"/>
+          <w:sz w:val="24"/>
+        </w:rPr>
+        <w:t>Which agents use which tier</w:t>
+      </w:r>
+    </w:p>
+    <w:tbl>
+      <w:tblPr>
+        <w:tblStyle w:val="TableGrid"/>
+        <w:tblW w:type="auto" w:w="0"/>
+        <w:jc w:val="left"/>
+        <w:tblLook w:firstColumn="1" w:firstRow="1" w:lastColumn="0" w:lastRow="0" w:noHBand="0" w:noVBand="1" w:val="04A0"/>
+      </w:tblPr>
+      <w:tblGrid>
+        <w:gridCol w:w="3024"/>
+        <w:gridCol w:w="3024"/>
+        <w:gridCol w:w="3024"/>
+      </w:tblGrid>
+      <w:tr>
+        <w:tc>
+          <w:tcPr>
+            <w:tcW w:type="dxa" w:w="3024"/>
+            <w:shd w:val="clear" w:color="auto" w:fill="25415C"/>
+            <w:tcMar>
+              <w:top w:w="50" w:type="dxa"/>
+              <w:bottom w:w="50" w:type="dxa"/>
+              <w:start w:w="80" w:type="dxa"/>
+              <w:end w:w="80" w:type="dxa"/>
+            </w:tcMar>
+            <w:vAlign w:val="center"/>
+          </w:tcPr>
+          <w:p>
+            <w:r/>
+            <w:r>
+              <w:rPr>
+                <w:rFonts w:ascii="Arial" w:hAnsi="Arial"/>
+                <w:b/>
+                <w:i w:val="0"/>
+                <w:color w:val="FFFFFF"/>
+                <w:sz w:val="18"/>
+              </w:rPr>
+              <w:t>Agent</w:t>
+            </w:r>
+          </w:p>
+        </w:tc>
+        <w:tc>
+          <w:tcPr>
+            <w:tcW w:type="dxa" w:w="3024"/>
+            <w:shd w:val="clear" w:color="auto" w:fill="25415C"/>
+            <w:tcMar>
+              <w:top w:w="50" w:type="dxa"/>
+              <w:bottom w:w="50" w:type="dxa"/>
+              <w:start w:w="80" w:type="dxa"/>
+              <w:end w:w="80" w:type="dxa"/>
+            </w:tcMar>
+            <w:vAlign w:val="center"/>
+          </w:tcPr>
+          <w:p>
+            <w:r/>
+            <w:r>
+              <w:rPr>
+                <w:rFonts w:ascii="Arial" w:hAnsi="Arial"/>
+                <w:b/>
+                <w:i w:val="0"/>
+                <w:color w:val="FFFFFF"/>
+                <w:sz w:val="18"/>
+              </w:rPr>
+              <w:t>General KB</w:t>
+            </w:r>
+          </w:p>
+        </w:tc>
+        <w:tc>
+          <w:tcPr>
+            <w:tcW w:type="dxa" w:w="3024"/>
+            <w:shd w:val="clear" w:color="auto" w:fill="25415C"/>
+            <w:tcMar>
+              <w:top w:w="50" w:type="dxa"/>
+              <w:bottom w:w="50" w:type="dxa"/>
+              <w:start w:w="80" w:type="dxa"/>
+              <w:end w:w="80" w:type="dxa"/>
+            </w:tcMar>
+            <w:vAlign w:val="center"/>
+          </w:tcPr>
+          <w:p>
+            <w:r/>
+            <w:r>
+              <w:rPr>
+                <w:rFonts w:ascii="Arial" w:hAnsi="Arial"/>
+                <w:b/>
+                <w:i w:val="0"/>
+                <w:color w:val="FFFFFF"/>
+                <w:sz w:val="18"/>
+              </w:rPr>
+              <w:t>Customer KB</w:t>
+            </w:r>
+          </w:p>
+        </w:tc>
+      </w:tr>
+      <w:tr>
+        <w:tc>
+          <w:tcPr>
+            <w:tcW w:type="dxa" w:w="3024"/>
+            <w:tcMar>
+              <w:top w:w="50" w:type="dxa"/>
+              <w:bottom w:w="50" w:type="dxa"/>
+              <w:start w:w="80" w:type="dxa"/>
+              <w:end w:w="80" w:type="dxa"/>
+            </w:tcMar>
+            <w:vAlign w:val="center"/>
+          </w:tcPr>
+          <w:p>
+            <w:r/>
+            <w:r>
+              <w:rPr>
+                <w:rFonts w:ascii="Arial" w:hAnsi="Arial"/>
+                <w:b w:val="0"/>
+                <w:i w:val="0"/>
+                <w:color w:val="000000"/>
+                <w:sz w:val="18"/>
+              </w:rPr>
+              <w:t>**Tender**</w:t>
+            </w:r>
+          </w:p>
+        </w:tc>
+        <w:tc>
+          <w:tcPr>
+            <w:tcW w:type="dxa" w:w="3024"/>
+            <w:tcMar>
+              <w:top w:w="50" w:type="dxa"/>
+              <w:bottom w:w="50" w:type="dxa"/>
+              <w:start w:w="80" w:type="dxa"/>
+              <w:end w:w="80" w:type="dxa"/>
+            </w:tcMar>
+            <w:vAlign w:val="center"/>
+          </w:tcPr>
+          <w:p>
+            <w:r/>
+            <w:r>
+              <w:rPr>
+                <w:rFonts w:ascii="Arial" w:hAnsi="Arial"/>
+                <w:b w:val="0"/>
+                <w:i w:val="0"/>
+                <w:color w:val="000000"/>
+                <w:sz w:val="18"/>
+              </w:rPr>
+              <w:t>`ttc-general/`, `Finance/`</w:t>
+            </w:r>
+          </w:p>
+        </w:tc>
+        <w:tc>
+          <w:tcPr>
+            <w:tcW w:type="dxa" w:w="3024"/>
+            <w:tcMar>
+              <w:top w:w="50" w:type="dxa"/>
+              <w:bottom w:w="50" w:type="dxa"/>
+              <w:start w:w="80" w:type="dxa"/>
+              <w:end w:w="80" w:type="dxa"/>
+            </w:tcMar>
+            <w:vAlign w:val="center"/>
+          </w:tcPr>
+          <w:p>
+            <w:r/>
+            <w:r>
+              <w:rPr>
+                <w:rFonts w:ascii="Arial" w:hAnsi="Arial"/>
+                <w:b w:val="0"/>
+                <w:i w:val="0"/>
+                <w:color w:val="000000"/>
+                <w:sz w:val="18"/>
+              </w:rPr>
+              <w:t>✅ scoped per customer</w:t>
+            </w:r>
+          </w:p>
+        </w:tc>
+      </w:tr>
+      <w:tr>
+        <w:tc>
+          <w:tcPr>
+            <w:tcW w:type="dxa" w:w="3024"/>
+            <w:tcMar>
+              <w:top w:w="50" w:type="dxa"/>
+              <w:bottom w:w="50" w:type="dxa"/>
+              <w:start w:w="80" w:type="dxa"/>
+              <w:end w:w="80" w:type="dxa"/>
+            </w:tcMar>
+            <w:shd w:val="clear" w:color="auto" w:fill="E9EDF0"/>
+            <w:vAlign w:val="center"/>
+          </w:tcPr>
+          <w:p>
+            <w:r/>
+            <w:r>
+              <w:rPr>
+                <w:rFonts w:ascii="Arial" w:hAnsi="Arial"/>
+                <w:b w:val="0"/>
+                <w:i w:val="0"/>
+                <w:color w:val="000000"/>
+                <w:sz w:val="18"/>
+              </w:rPr>
+              <w:t>**Contracts**</w:t>
+            </w:r>
+          </w:p>
+        </w:tc>
+        <w:tc>
+          <w:tcPr>
+            <w:tcW w:type="dxa" w:w="3024"/>
+            <w:tcMar>
+              <w:top w:w="50" w:type="dxa"/>
+              <w:bottom w:w="50" w:type="dxa"/>
+              <w:start w:w="80" w:type="dxa"/>
+              <w:end w:w="80" w:type="dxa"/>
+            </w:tcMar>
+            <w:shd w:val="clear" w:color="auto" w:fill="E9EDF0"/>
+            <w:vAlign w:val="center"/>
+          </w:tcPr>
+          <w:p>
+            <w:r/>
+            <w:r>
+              <w:rPr>
+                <w:rFonts w:ascii="Arial" w:hAnsi="Arial"/>
+                <w:b w:val="0"/>
+                <w:i w:val="0"/>
+                <w:color w:val="000000"/>
+                <w:sz w:val="18"/>
+              </w:rPr>
+              <w:t>`Finance/Contract Templates TTC/`</w:t>
+            </w:r>
+          </w:p>
+        </w:tc>
+        <w:tc>
+          <w:tcPr>
+            <w:tcW w:type="dxa" w:w="3024"/>
+            <w:tcMar>
+              <w:top w:w="50" w:type="dxa"/>
+              <w:bottom w:w="50" w:type="dxa"/>
+              <w:start w:w="80" w:type="dxa"/>
+              <w:end w:w="80" w:type="dxa"/>
+            </w:tcMar>
+            <w:shd w:val="clear" w:color="auto" w:fill="E9EDF0"/>
+            <w:vAlign w:val="center"/>
+          </w:tcPr>
+          <w:p>
+            <w:r/>
+            <w:r>
+              <w:rPr>
+                <w:rFonts w:ascii="Arial" w:hAnsi="Arial"/>
+                <w:b w:val="0"/>
+                <w:i w:val="0"/>
+                <w:color w:val="000000"/>
+                <w:sz w:val="18"/>
+              </w:rPr>
+              <w:t>✅ scoped per customer</w:t>
+            </w:r>
+          </w:p>
+        </w:tc>
+      </w:tr>
+      <w:tr>
+        <w:tc>
+          <w:tcPr>
+            <w:tcW w:type="dxa" w:w="3024"/>
+            <w:tcMar>
+              <w:top w:w="50" w:type="dxa"/>
+              <w:bottom w:w="50" w:type="dxa"/>
+              <w:start w:w="80" w:type="dxa"/>
+              <w:end w:w="80" w:type="dxa"/>
+            </w:tcMar>
+            <w:vAlign w:val="center"/>
+          </w:tcPr>
+          <w:p>
+            <w:r/>
+            <w:r>
+              <w:rPr>
+                <w:rFonts w:ascii="Arial" w:hAnsi="Arial"/>
+                <w:b w:val="0"/>
+                <w:i w:val="0"/>
+                <w:color w:val="000000"/>
+                <w:sz w:val="18"/>
+              </w:rPr>
+              <w:t>**Test**</w:t>
+            </w:r>
+          </w:p>
+        </w:tc>
+        <w:tc>
+          <w:tcPr>
+            <w:tcW w:type="dxa" w:w="3024"/>
+            <w:tcMar>
+              <w:top w:w="50" w:type="dxa"/>
+              <w:bottom w:w="50" w:type="dxa"/>
+              <w:start w:w="80" w:type="dxa"/>
+              <w:end w:w="80" w:type="dxa"/>
+            </w:tcMar>
+            <w:vAlign w:val="center"/>
+          </w:tcPr>
+          <w:p>
+            <w:r/>
+            <w:r>
+              <w:rPr>
+                <w:rFonts w:ascii="Arial" w:hAnsi="Arial"/>
+                <w:b w:val="0"/>
+                <w:i w:val="0"/>
+                <w:color w:val="000000"/>
+                <w:sz w:val="18"/>
+              </w:rPr>
+              <w:t>`BwBm/`, `ttc-general/`</w:t>
+            </w:r>
+          </w:p>
+        </w:tc>
+        <w:tc>
+          <w:tcPr>
+            <w:tcW w:type="dxa" w:w="3024"/>
+            <w:tcMar>
+              <w:top w:w="50" w:type="dxa"/>
+              <w:bottom w:w="50" w:type="dxa"/>
+              <w:start w:w="80" w:type="dxa"/>
+              <w:end w:w="80" w:type="dxa"/>
+            </w:tcMar>
+            <w:vAlign w:val="center"/>
+          </w:tcPr>
+          <w:p>
+            <w:r/>
+            <w:r>
+              <w:rPr>
+                <w:rFonts w:ascii="Arial" w:hAnsi="Arial"/>
+                <w:b w:val="0"/>
+                <w:i w:val="0"/>
+                <w:color w:val="000000"/>
+                <w:sz w:val="18"/>
+              </w:rPr>
+              <w:t>✅ scoped per customer</w:t>
+            </w:r>
+          </w:p>
+        </w:tc>
+      </w:tr>
+      <w:tr>
+        <w:tc>
+          <w:tcPr>
+            <w:tcW w:type="dxa" w:w="3024"/>
+            <w:tcMar>
+              <w:top w:w="50" w:type="dxa"/>
+              <w:bottom w:w="50" w:type="dxa"/>
+              <w:start w:w="80" w:type="dxa"/>
+              <w:end w:w="80" w:type="dxa"/>
+            </w:tcMar>
+            <w:shd w:val="clear" w:color="auto" w:fill="E9EDF0"/>
+            <w:vAlign w:val="center"/>
+          </w:tcPr>
+          <w:p>
+            <w:r/>
+            <w:r>
+              <w:rPr>
+                <w:rFonts w:ascii="Arial" w:hAnsi="Arial"/>
+                <w:b w:val="0"/>
+                <w:i w:val="0"/>
+                <w:color w:val="000000"/>
+                <w:sz w:val="18"/>
+              </w:rPr>
+              <w:t>**TAF**</w:t>
+            </w:r>
+          </w:p>
+        </w:tc>
+        <w:tc>
+          <w:tcPr>
+            <w:tcW w:type="dxa" w:w="3024"/>
+            <w:tcMar>
+              <w:top w:w="50" w:type="dxa"/>
+              <w:bottom w:w="50" w:type="dxa"/>
+              <w:start w:w="80" w:type="dxa"/>
+              <w:end w:w="80" w:type="dxa"/>
+            </w:tcMar>
+            <w:shd w:val="clear" w:color="auto" w:fill="E9EDF0"/>
+            <w:vAlign w:val="center"/>
+          </w:tcPr>
+          <w:p>
+            <w:r/>
+            <w:r>
+              <w:rPr>
+                <w:rFonts w:ascii="Arial" w:hAnsi="Arial"/>
+                <w:b w:val="0"/>
+                <w:i w:val="0"/>
+                <w:color w:val="000000"/>
+                <w:sz w:val="18"/>
+              </w:rPr>
+              <w:t>`ttc-general/`</w:t>
+            </w:r>
+          </w:p>
+        </w:tc>
+        <w:tc>
+          <w:tcPr>
+            <w:tcW w:type="dxa" w:w="3024"/>
+            <w:tcMar>
+              <w:top w:w="50" w:type="dxa"/>
+              <w:bottom w:w="50" w:type="dxa"/>
+              <w:start w:w="80" w:type="dxa"/>
+              <w:end w:w="80" w:type="dxa"/>
+            </w:tcMar>
+            <w:shd w:val="clear" w:color="auto" w:fill="E9EDF0"/>
+            <w:vAlign w:val="center"/>
+          </w:tcPr>
+          <w:p>
+            <w:r/>
+            <w:r>
+              <w:rPr>
+                <w:rFonts w:ascii="Arial" w:hAnsi="Arial"/>
+                <w:b w:val="0"/>
+                <w:i w:val="0"/>
+                <w:color w:val="000000"/>
+                <w:sz w:val="18"/>
+              </w:rPr>
+              <w:t>✅ reads customer context for test scope</w:t>
+            </w:r>
+          </w:p>
+        </w:tc>
+      </w:tr>
+      <w:tr>
+        <w:tc>
+          <w:tcPr>
+            <w:tcW w:type="dxa" w:w="3024"/>
+            <w:tcMar>
+              <w:top w:w="50" w:type="dxa"/>
+              <w:bottom w:w="50" w:type="dxa"/>
+              <w:start w:w="80" w:type="dxa"/>
+              <w:end w:w="80" w:type="dxa"/>
+            </w:tcMar>
+            <w:vAlign w:val="center"/>
+          </w:tcPr>
+          <w:p>
+            <w:r/>
+            <w:r>
+              <w:rPr>
+                <w:rFonts w:ascii="Arial" w:hAnsi="Arial"/>
+                <w:b w:val="0"/>
+                <w:i w:val="0"/>
+                <w:color w:val="000000"/>
+                <w:sz w:val="18"/>
+              </w:rPr>
+              <w:t>**QA TOM Generator**</w:t>
+            </w:r>
+          </w:p>
+        </w:tc>
+        <w:tc>
+          <w:tcPr>
+            <w:tcW w:type="dxa" w:w="3024"/>
+            <w:tcMar>
+              <w:top w:w="50" w:type="dxa"/>
+              <w:bottom w:w="50" w:type="dxa"/>
+              <w:start w:w="80" w:type="dxa"/>
+              <w:end w:w="80" w:type="dxa"/>
+            </w:tcMar>
+            <w:vAlign w:val="center"/>
+          </w:tcPr>
+          <w:p>
+            <w:r/>
+            <w:r>
+              <w:rPr>
+                <w:rFonts w:ascii="Arial" w:hAnsi="Arial"/>
+                <w:b w:val="0"/>
+                <w:i w:val="0"/>
+                <w:color w:val="000000"/>
+                <w:sz w:val="18"/>
+              </w:rPr>
+              <w:t>`ttc-general/`, methodology</w:t>
+            </w:r>
+          </w:p>
+        </w:tc>
+        <w:tc>
+          <w:tcPr>
+            <w:tcW w:type="dxa" w:w="3024"/>
+            <w:tcMar>
+              <w:top w:w="50" w:type="dxa"/>
+              <w:bottom w:w="50" w:type="dxa"/>
+              <w:start w:w="80" w:type="dxa"/>
+              <w:end w:w="80" w:type="dxa"/>
+            </w:tcMar>
+            <w:vAlign w:val="center"/>
+          </w:tcPr>
+          <w:p>
+            <w:r/>
+            <w:r>
+              <w:rPr>
+                <w:rFonts w:ascii="Arial" w:hAnsi="Arial"/>
+                <w:b w:val="0"/>
+                <w:i w:val="0"/>
+                <w:color w:val="000000"/>
+                <w:sz w:val="18"/>
+              </w:rPr>
+              <w:t>✅ scoped per customer</w:t>
+            </w:r>
+          </w:p>
+        </w:tc>
+      </w:tr>
+      <w:tr>
+        <w:tc>
+          <w:tcPr>
+            <w:tcW w:type="dxa" w:w="3024"/>
+            <w:tcMar>
+              <w:top w:w="50" w:type="dxa"/>
+              <w:bottom w:w="50" w:type="dxa"/>
+              <w:start w:w="80" w:type="dxa"/>
+              <w:end w:w="80" w:type="dxa"/>
+            </w:tcMar>
+            <w:shd w:val="clear" w:color="auto" w:fill="E9EDF0"/>
+            <w:vAlign w:val="center"/>
+          </w:tcPr>
+          <w:p>
+            <w:r/>
+            <w:r>
+              <w:rPr>
+                <w:rFonts w:ascii="Arial" w:hAnsi="Arial"/>
+                <w:b w:val="0"/>
+                <w:i w:val="0"/>
+                <w:color w:val="000000"/>
+                <w:sz w:val="18"/>
+              </w:rPr>
+              <w:t>**SAP**</w:t>
+            </w:r>
+          </w:p>
+        </w:tc>
+        <w:tc>
+          <w:tcPr>
+            <w:tcW w:type="dxa" w:w="3024"/>
+            <w:tcMar>
+              <w:top w:w="50" w:type="dxa"/>
+              <w:bottom w:w="50" w:type="dxa"/>
+              <w:start w:w="80" w:type="dxa"/>
+              <w:end w:w="80" w:type="dxa"/>
+            </w:tcMar>
+            <w:shd w:val="clear" w:color="auto" w:fill="E9EDF0"/>
+            <w:vAlign w:val="center"/>
+          </w:tcPr>
+          <w:p>
+            <w:r/>
+            <w:r>
+              <w:rPr>
+                <w:rFonts w:ascii="Arial" w:hAnsi="Arial"/>
+                <w:b w:val="0"/>
+                <w:i w:val="0"/>
+                <w:color w:val="000000"/>
+                <w:sz w:val="18"/>
+              </w:rPr>
+              <w:t>`BwBm/`</w:t>
+            </w:r>
+          </w:p>
+        </w:tc>
+        <w:tc>
+          <w:tcPr>
+            <w:tcW w:type="dxa" w:w="3024"/>
+            <w:tcMar>
+              <w:top w:w="50" w:type="dxa"/>
+              <w:bottom w:w="50" w:type="dxa"/>
+              <w:start w:w="80" w:type="dxa"/>
+              <w:end w:w="80" w:type="dxa"/>
+            </w:tcMar>
+            <w:shd w:val="clear" w:color="auto" w:fill="E9EDF0"/>
+            <w:vAlign w:val="center"/>
+          </w:tcPr>
+          <w:p>
+            <w:r/>
+            <w:r>
+              <w:rPr>
+                <w:rFonts w:ascii="Arial" w:hAnsi="Arial"/>
+                <w:b w:val="0"/>
+                <w:i w:val="0"/>
+                <w:color w:val="000000"/>
+                <w:sz w:val="18"/>
+              </w:rPr>
+              <w:t>✅ when working on customer SAP landscape</w:t>
+            </w:r>
+          </w:p>
+        </w:tc>
+      </w:tr>
+      <w:tr>
+        <w:tc>
+          <w:tcPr>
+            <w:tcW w:type="dxa" w:w="3024"/>
+            <w:tcMar>
+              <w:top w:w="50" w:type="dxa"/>
+              <w:bottom w:w="50" w:type="dxa"/>
+              <w:start w:w="80" w:type="dxa"/>
+              <w:end w:w="80" w:type="dxa"/>
+            </w:tcMar>
+            <w:vAlign w:val="center"/>
+          </w:tcPr>
+          <w:p>
+            <w:r/>
+            <w:r>
+              <w:rPr>
+                <w:rFonts w:ascii="Arial" w:hAnsi="Arial"/>
+                <w:b w:val="0"/>
+                <w:i w:val="0"/>
+                <w:color w:val="000000"/>
+                <w:sz w:val="18"/>
+              </w:rPr>
+              <w:t>**BwBm**</w:t>
+            </w:r>
+          </w:p>
+        </w:tc>
+        <w:tc>
+          <w:tcPr>
+            <w:tcW w:type="dxa" w:w="3024"/>
+            <w:tcMar>
+              <w:top w:w="50" w:type="dxa"/>
+              <w:bottom w:w="50" w:type="dxa"/>
+              <w:start w:w="80" w:type="dxa"/>
+              <w:end w:w="80" w:type="dxa"/>
+            </w:tcMar>
+            <w:vAlign w:val="center"/>
+          </w:tcPr>
+          <w:p>
+            <w:r/>
+            <w:r>
+              <w:rPr>
+                <w:rFonts w:ascii="Arial" w:hAnsi="Arial"/>
+                <w:b w:val="0"/>
+                <w:i w:val="0"/>
+                <w:color w:val="000000"/>
+                <w:sz w:val="18"/>
+              </w:rPr>
+              <w:t>`BwBm/` (internal project — stays Tier 1)</w:t>
+            </w:r>
+          </w:p>
+        </w:tc>
+        <w:tc>
+          <w:tcPr>
+            <w:tcW w:type="dxa" w:w="3024"/>
+            <w:tcMar>
+              <w:top w:w="50" w:type="dxa"/>
+              <w:bottom w:w="50" w:type="dxa"/>
+              <w:start w:w="80" w:type="dxa"/>
+              <w:end w:w="80" w:type="dxa"/>
+            </w:tcMar>
+            <w:vAlign w:val="center"/>
+          </w:tcPr>
+          <w:p>
+            <w:r/>
+            <w:r>
+              <w:rPr>
+                <w:rFonts w:ascii="Arial" w:hAnsi="Arial"/>
+                <w:b w:val="0"/>
+                <w:i w:val="0"/>
+                <w:color w:val="000000"/>
+                <w:sz w:val="18"/>
+              </w:rPr>
+              <w:t>rarely</w:t>
+            </w:r>
+          </w:p>
+        </w:tc>
+      </w:tr>
+      <w:tr>
+        <w:tc>
+          <w:tcPr>
+            <w:tcW w:type="dxa" w:w="3024"/>
+            <w:tcMar>
+              <w:top w:w="50" w:type="dxa"/>
+              <w:bottom w:w="50" w:type="dxa"/>
+              <w:start w:w="80" w:type="dxa"/>
+              <w:end w:w="80" w:type="dxa"/>
+            </w:tcMar>
+            <w:shd w:val="clear" w:color="auto" w:fill="E9EDF0"/>
+            <w:vAlign w:val="center"/>
+          </w:tcPr>
+          <w:p>
+            <w:r/>
+            <w:r>
+              <w:rPr>
+                <w:rFonts w:ascii="Arial" w:hAnsi="Arial"/>
+                <w:b w:val="0"/>
+                <w:i w:val="0"/>
+                <w:color w:val="000000"/>
+                <w:sz w:val="18"/>
+              </w:rPr>
+              <w:t>**Infrastructure**</w:t>
+            </w:r>
+          </w:p>
+        </w:tc>
+        <w:tc>
+          <w:tcPr>
+            <w:tcW w:type="dxa" w:w="3024"/>
+            <w:tcMar>
+              <w:top w:w="50" w:type="dxa"/>
+              <w:bottom w:w="50" w:type="dxa"/>
+              <w:start w:w="80" w:type="dxa"/>
+              <w:end w:w="80" w:type="dxa"/>
+            </w:tcMar>
+            <w:shd w:val="clear" w:color="auto" w:fill="E9EDF0"/>
+            <w:vAlign w:val="center"/>
+          </w:tcPr>
+          <w:p>
+            <w:r/>
+            <w:r>
+              <w:rPr>
+                <w:rFonts w:ascii="Arial" w:hAnsi="Arial"/>
+                <w:b w:val="0"/>
+                <w:i w:val="0"/>
+                <w:color w:val="000000"/>
+                <w:sz w:val="18"/>
+              </w:rPr>
+              <w:t>documents the framework itself</w:t>
+            </w:r>
+          </w:p>
+        </w:tc>
+        <w:tc>
+          <w:tcPr>
+            <w:tcW w:type="dxa" w:w="3024"/>
+            <w:tcMar>
+              <w:top w:w="50" w:type="dxa"/>
+              <w:bottom w:w="50" w:type="dxa"/>
+              <w:start w:w="80" w:type="dxa"/>
+              <w:end w:w="80" w:type="dxa"/>
+            </w:tcMar>
+            <w:shd w:val="clear" w:color="auto" w:fill="E9EDF0"/>
+            <w:vAlign w:val="center"/>
+          </w:tcPr>
+          <w:p>
+            <w:r/>
+            <w:r>
+              <w:rPr>
+                <w:rFonts w:ascii="Arial" w:hAnsi="Arial"/>
+                <w:b w:val="0"/>
+                <w:i w:val="0"/>
+                <w:color w:val="000000"/>
+                <w:sz w:val="18"/>
+              </w:rPr>
+              <w:t>—</w:t>
+            </w:r>
+          </w:p>
+        </w:tc>
+      </w:tr>
+      <w:tr>
+        <w:tc>
+          <w:tcPr>
+            <w:tcW w:type="dxa" w:w="3024"/>
+            <w:tcMar>
+              <w:top w:w="50" w:type="dxa"/>
+              <w:bottom w:w="50" w:type="dxa"/>
+              <w:start w:w="80" w:type="dxa"/>
+              <w:end w:w="80" w:type="dxa"/>
+            </w:tcMar>
+            <w:vAlign w:val="center"/>
+          </w:tcPr>
+          <w:p>
+            <w:r/>
+            <w:r>
+              <w:rPr>
+                <w:rFonts w:ascii="Arial" w:hAnsi="Arial"/>
+                <w:b w:val="0"/>
+                <w:i w:val="0"/>
+                <w:color w:val="000000"/>
+                <w:sz w:val="18"/>
+              </w:rPr>
+              <w:t>Finance, HR, Odoo, Personal, Private, PPTX</w:t>
+            </w:r>
+          </w:p>
+        </w:tc>
+        <w:tc>
+          <w:tcPr>
+            <w:tcW w:type="dxa" w:w="3024"/>
+            <w:tcMar>
+              <w:top w:w="50" w:type="dxa"/>
+              <w:bottom w:w="50" w:type="dxa"/>
+              <w:start w:w="80" w:type="dxa"/>
+              <w:end w:w="80" w:type="dxa"/>
+            </w:tcMar>
+            <w:vAlign w:val="center"/>
+          </w:tcPr>
+          <w:p>
+            <w:r/>
+            <w:r>
+              <w:rPr>
+                <w:rFonts w:ascii="Arial" w:hAnsi="Arial"/>
+                <w:b w:val="0"/>
+                <w:i w:val="0"/>
+                <w:color w:val="000000"/>
+                <w:sz w:val="18"/>
+              </w:rPr>
+              <w:t>their own reference</w:t>
+            </w:r>
+          </w:p>
+        </w:tc>
+        <w:tc>
+          <w:tcPr>
+            <w:tcW w:type="dxa" w:w="3024"/>
+            <w:tcMar>
+              <w:top w:w="50" w:type="dxa"/>
+              <w:bottom w:w="50" w:type="dxa"/>
+              <w:start w:w="80" w:type="dxa"/>
+              <w:end w:w="80" w:type="dxa"/>
+            </w:tcMar>
+            <w:vAlign w:val="center"/>
+          </w:tcPr>
+          <w:p>
+            <w:r/>
+            <w:r>
+              <w:rPr>
+                <w:rFonts w:ascii="Arial" w:hAnsi="Arial"/>
+                <w:b w:val="0"/>
+                <w:i w:val="0"/>
+                <w:color w:val="000000"/>
+                <w:sz w:val="18"/>
+              </w:rPr>
+              <w:t>— (don't touch customer KBs)</w:t>
+            </w:r>
+          </w:p>
+        </w:tc>
+      </w:tr>
+    </w:tbl>
+    <w:p/>
+    <w:p>
+      <w:r>
+        <w:rPr>
+          <w:rFonts w:ascii="Arial" w:hAnsi="Arial"/>
+          <w:b w:val="0"/>
+          <w:i w:val="0"/>
+          <w:color w:val="000000"/>
+          <w:sz w:val="20"/>
+        </w:rPr>
+        <w:t>The agents know the split — you don't have to think about it. Just tell them the customer name and they'll look in the right place.</w:t>
+      </w:r>
+    </w:p>
+    <w:p>
+      <w:pPr>
+        <w:pStyle w:val="Heading3"/>
+      </w:pPr>
+      <w:r>
+        <w:rPr>
+          <w:rFonts w:ascii="Arial" w:hAnsi="Arial"/>
+          <w:color w:val="25415C"/>
+          <w:sz w:val="24"/>
+        </w:rPr>
+        <w:t>Working with a new customer</w:t>
+      </w:r>
+    </w:p>
+    <w:p>
+      <w:r>
+        <w:rPr>
+          <w:rFonts w:ascii="Arial" w:hAnsi="Arial"/>
+          <w:b w:val="0"/>
+          <w:i w:val="0"/>
+          <w:color w:val="000000"/>
+          <w:sz w:val="20"/>
+        </w:rPr>
+        <w:t>When you start on a customer the framework hasn't seen before, the agent will run one command:</w:t>
+      </w:r>
+    </w:p>
+    <w:p>
+      <w:pPr>
+        <w:spacing w:before="120" w:after="120"/>
+        <w:ind w:left="567"/>
+        <w:shd w:val="clear" w:color="auto" w:fill="E9EDF0"/>
+      </w:pPr>
+      <w:r>
+        <w:rPr>
+          <w:rFonts w:ascii="Courier New" w:hAnsi="Courier New"/>
+          <w:color w:val="25415C"/>
+          <w:sz w:val="16"/>
+        </w:rPr>
+        <w:t>~/AI-Vault/Claude\ Folder/kb_bootstrap_customer.sh "Customer Name"</w:t>
+      </w:r>
+    </w:p>
+    <w:p>
+      <w:r>
+        <w:rPr>
+          <w:rFonts w:ascii="Arial" w:hAnsi="Arial"/>
+          <w:b w:val="0"/>
+          <w:i w:val="0"/>
+          <w:color w:val="000000"/>
+          <w:sz w:val="20"/>
+        </w:rPr>
+        <w:t>This creates the hidden `AI-INFO - DO NOT DELETE/` folder inside their OneDrive customer folder, seeds `README.md`, `notes.md`, `memory.md`, and adds the customer to the registry. It's idempotent — running it again is safe.</w:t>
+      </w:r>
+    </w:p>
+    <w:p>
+      <w:r>
+        <w:rPr>
+          <w:rFonts w:ascii="Arial" w:hAnsi="Arial"/>
+          <w:b w:val="0"/>
+          <w:i w:val="0"/>
+          <w:color w:val="000000"/>
+          <w:sz w:val="20"/>
+        </w:rPr>
+        <w:t>To rebuild the searchable index (e.g. after new proposals were added):</w:t>
+      </w:r>
+    </w:p>
+    <w:p>
+      <w:pPr>
+        <w:spacing w:before="120" w:after="120"/>
+        <w:ind w:left="567"/>
+        <w:shd w:val="clear" w:color="auto" w:fill="E9EDF0"/>
+      </w:pPr>
+      <w:r>
+        <w:rPr>
+          <w:rFonts w:ascii="Courier New" w:hAnsi="Courier New"/>
+          <w:color w:val="25415C"/>
+          <w:sz w:val="16"/>
+        </w:rPr>
+        <w:t>~/AI-Vault/Claude\ Folder/kb_refresh_customer.sh "Customer Name"</w:t>
+      </w:r>
+    </w:p>
+    <w:p>
+      <w:r>
+        <w:rPr>
+          <w:rFonts w:ascii="Arial" w:hAnsi="Arial"/>
+          <w:b w:val="0"/>
+          <w:i w:val="0"/>
+          <w:color w:val="000000"/>
+          <w:sz w:val="20"/>
+        </w:rPr>
+        <w:t>The full rule book lives in `~/AI-Vault/docs/KB_CONVENTIONS.md`.</w:t>
+      </w:r>
+    </w:p>
+    <w:p>
+      <w:pPr>
+        <w:pStyle w:val="Heading3"/>
+      </w:pPr>
+      <w:r>
+        <w:rPr>
+          <w:rFonts w:ascii="Arial" w:hAnsi="Arial"/>
+          <w:color w:val="25415C"/>
+          <w:sz w:val="24"/>
+        </w:rPr>
+        <w:t>Storage rules cheat sheet</w:t>
+      </w:r>
+    </w:p>
+    <w:tbl>
+      <w:tblPr>
+        <w:tblStyle w:val="TableGrid"/>
+        <w:tblW w:type="auto" w:w="0"/>
+        <w:jc w:val="left"/>
+        <w:tblLook w:firstColumn="1" w:firstRow="1" w:lastColumn="0" w:lastRow="0" w:noHBand="0" w:noVBand="1" w:val="04A0"/>
+      </w:tblPr>
+      <w:tblGrid>
+        <w:gridCol w:w="4536"/>
+        <w:gridCol w:w="4536"/>
+      </w:tblGrid>
+      <w:tr>
+        <w:tc>
+          <w:tcPr>
+            <w:tcW w:type="dxa" w:w="4536"/>
+            <w:shd w:val="clear" w:color="auto" w:fill="25415C"/>
+            <w:tcMar>
+              <w:top w:w="50" w:type="dxa"/>
+              <w:bottom w:w="50" w:type="dxa"/>
+              <w:start w:w="80" w:type="dxa"/>
+              <w:end w:w="80" w:type="dxa"/>
+            </w:tcMar>
+            <w:vAlign w:val="center"/>
+          </w:tcPr>
+          <w:p>
+            <w:r/>
+            <w:r>
+              <w:rPr>
+                <w:rFonts w:ascii="Arial" w:hAnsi="Arial"/>
+                <w:b/>
+                <w:i w:val="0"/>
+                <w:color w:val="FFFFFF"/>
+                <w:sz w:val="18"/>
+              </w:rPr>
+              <w:t>What you're producing</w:t>
+            </w:r>
+          </w:p>
+        </w:tc>
+        <w:tc>
+          <w:tcPr>
+            <w:tcW w:type="dxa" w:w="4536"/>
+            <w:shd w:val="clear" w:color="auto" w:fill="25415C"/>
+            <w:tcMar>
+              <w:top w:w="50" w:type="dxa"/>
+              <w:bottom w:w="50" w:type="dxa"/>
+              <w:start w:w="80" w:type="dxa"/>
+              <w:end w:w="80" w:type="dxa"/>
+            </w:tcMar>
+            <w:vAlign w:val="center"/>
+          </w:tcPr>
+          <w:p>
+            <w:r/>
+            <w:r>
+              <w:rPr>
+                <w:rFonts w:ascii="Arial" w:hAnsi="Arial"/>
+                <w:b/>
+                <w:i w:val="0"/>
+                <w:color w:val="FFFFFF"/>
+                <w:sz w:val="18"/>
+              </w:rPr>
+              <w:t>Where it goes</w:t>
+            </w:r>
+          </w:p>
+        </w:tc>
+      </w:tr>
+      <w:tr>
+        <w:tc>
+          <w:tcPr>
+            <w:tcW w:type="dxa" w:w="4536"/>
+            <w:tcMar>
+              <w:top w:w="50" w:type="dxa"/>
+              <w:bottom w:w="50" w:type="dxa"/>
+              <w:start w:w="80" w:type="dxa"/>
+              <w:end w:w="80" w:type="dxa"/>
+            </w:tcMar>
+            <w:vAlign w:val="center"/>
+          </w:tcPr>
+          <w:p>
+            <w:r/>
+            <w:r>
+              <w:rPr>
+                <w:rFonts w:ascii="Arial" w:hAnsi="Arial"/>
+                <w:b w:val="0"/>
+                <w:i w:val="0"/>
+                <w:color w:val="000000"/>
+                <w:sz w:val="18"/>
+              </w:rPr>
+              <w:t>Drafts, in-progress work</w:t>
+            </w:r>
+          </w:p>
+        </w:tc>
+        <w:tc>
+          <w:tcPr>
+            <w:tcW w:type="dxa" w:w="4536"/>
+            <w:tcMar>
+              <w:top w:w="50" w:type="dxa"/>
+              <w:bottom w:w="50" w:type="dxa"/>
+              <w:start w:w="80" w:type="dxa"/>
+              <w:end w:w="80" w:type="dxa"/>
+            </w:tcMar>
+            <w:vAlign w:val="center"/>
+          </w:tcPr>
+          <w:p>
+            <w:r/>
+            <w:r>
+              <w:rPr>
+                <w:rFonts w:ascii="Arial" w:hAnsi="Arial"/>
+                <w:b w:val="0"/>
+                <w:i w:val="0"/>
+                <w:color w:val="000000"/>
+                <w:sz w:val="18"/>
+              </w:rPr>
+              <w:t>`~/AI-Vault/Agents/&lt;Agent&gt;/working/`</w:t>
+            </w:r>
+          </w:p>
+        </w:tc>
+      </w:tr>
+      <w:tr>
+        <w:tc>
+          <w:tcPr>
+            <w:tcW w:type="dxa" w:w="4536"/>
+            <w:tcMar>
+              <w:top w:w="50" w:type="dxa"/>
+              <w:bottom w:w="50" w:type="dxa"/>
+              <w:start w:w="80" w:type="dxa"/>
+              <w:end w:w="80" w:type="dxa"/>
+            </w:tcMar>
+            <w:shd w:val="clear" w:color="auto" w:fill="E9EDF0"/>
+            <w:vAlign w:val="center"/>
+          </w:tcPr>
+          <w:p>
+            <w:r/>
+            <w:r>
+              <w:rPr>
+                <w:rFonts w:ascii="Arial" w:hAnsi="Arial"/>
+                <w:b w:val="0"/>
+                <w:i w:val="0"/>
+                <w:color w:val="000000"/>
+                <w:sz w:val="18"/>
+              </w:rPr>
+              <w:t>Collaborative customer notes</w:t>
+            </w:r>
+          </w:p>
+        </w:tc>
+        <w:tc>
+          <w:tcPr>
+            <w:tcW w:type="dxa" w:w="4536"/>
+            <w:tcMar>
+              <w:top w:w="50" w:type="dxa"/>
+              <w:bottom w:w="50" w:type="dxa"/>
+              <w:start w:w="80" w:type="dxa"/>
+              <w:end w:w="80" w:type="dxa"/>
+            </w:tcMar>
+            <w:shd w:val="clear" w:color="auto" w:fill="E9EDF0"/>
+            <w:vAlign w:val="center"/>
+          </w:tcPr>
+          <w:p>
+            <w:r/>
+            <w:r>
+              <w:rPr>
+                <w:rFonts w:ascii="Arial" w:hAnsi="Arial"/>
+                <w:b w:val="0"/>
+                <w:i w:val="0"/>
+                <w:color w:val="000000"/>
+                <w:sz w:val="18"/>
+              </w:rPr>
+              <w:t>`&lt;customer&gt;/AI-INFO - DO NOT DELETE/notes.md`</w:t>
+            </w:r>
+          </w:p>
+        </w:tc>
+      </w:tr>
+      <w:tr>
+        <w:tc>
+          <w:tcPr>
+            <w:tcW w:type="dxa" w:w="4536"/>
+            <w:tcMar>
+              <w:top w:w="50" w:type="dxa"/>
+              <w:bottom w:w="50" w:type="dxa"/>
+              <w:start w:w="80" w:type="dxa"/>
+              <w:end w:w="80" w:type="dxa"/>
+            </w:tcMar>
+            <w:vAlign w:val="center"/>
+          </w:tcPr>
+          <w:p>
+            <w:r/>
+            <w:r>
+              <w:rPr>
+                <w:rFonts w:ascii="Arial" w:hAnsi="Arial"/>
+                <w:b w:val="0"/>
+                <w:i w:val="0"/>
+                <w:color w:val="000000"/>
+                <w:sz w:val="18"/>
+              </w:rPr>
+              <w:t>Agent session highlights</w:t>
+            </w:r>
+          </w:p>
+        </w:tc>
+        <w:tc>
+          <w:tcPr>
+            <w:tcW w:type="dxa" w:w="4536"/>
+            <w:tcMar>
+              <w:top w:w="50" w:type="dxa"/>
+              <w:bottom w:w="50" w:type="dxa"/>
+              <w:start w:w="80" w:type="dxa"/>
+              <w:end w:w="80" w:type="dxa"/>
+            </w:tcMar>
+            <w:vAlign w:val="center"/>
+          </w:tcPr>
+          <w:p>
+            <w:r/>
+            <w:r>
+              <w:rPr>
+                <w:rFonts w:ascii="Arial" w:hAnsi="Arial"/>
+                <w:b w:val="0"/>
+                <w:i w:val="0"/>
+                <w:color w:val="000000"/>
+                <w:sz w:val="18"/>
+              </w:rPr>
+              <w:t>`&lt;customer&gt;/AI-INFO - DO NOT DELETE/memory.md`</w:t>
+            </w:r>
+          </w:p>
+        </w:tc>
+      </w:tr>
+      <w:tr>
+        <w:tc>
+          <w:tcPr>
+            <w:tcW w:type="dxa" w:w="4536"/>
+            <w:tcMar>
+              <w:top w:w="50" w:type="dxa"/>
+              <w:bottom w:w="50" w:type="dxa"/>
+              <w:start w:w="80" w:type="dxa"/>
+              <w:end w:w="80" w:type="dxa"/>
+            </w:tcMar>
+            <w:shd w:val="clear" w:color="auto" w:fill="E9EDF0"/>
+            <w:vAlign w:val="center"/>
+          </w:tcPr>
+          <w:p>
+            <w:r/>
+            <w:r>
+              <w:rPr>
+                <w:rFonts w:ascii="Arial" w:hAnsi="Arial"/>
+                <w:b w:val="0"/>
+                <w:i w:val="0"/>
+                <w:color w:val="000000"/>
+                <w:sz w:val="18"/>
+              </w:rPr>
+              <w:t>Session memory (cross-customer)</w:t>
+            </w:r>
+          </w:p>
+        </w:tc>
+        <w:tc>
+          <w:tcPr>
+            <w:tcW w:type="dxa" w:w="4536"/>
+            <w:tcMar>
+              <w:top w:w="50" w:type="dxa"/>
+              <w:bottom w:w="50" w:type="dxa"/>
+              <w:start w:w="80" w:type="dxa"/>
+              <w:end w:w="80" w:type="dxa"/>
+            </w:tcMar>
+            <w:shd w:val="clear" w:color="auto" w:fill="E9EDF0"/>
+            <w:vAlign w:val="center"/>
+          </w:tcPr>
+          <w:p>
+            <w:r/>
+            <w:r>
+              <w:rPr>
+                <w:rFonts w:ascii="Arial" w:hAnsi="Arial"/>
+                <w:b w:val="0"/>
+                <w:i w:val="0"/>
+                <w:color w:val="000000"/>
+                <w:sz w:val="18"/>
+              </w:rPr>
+              <w:t>`~/AI-Vault/Agents/&lt;Agent&gt;/memory/`</w:t>
+            </w:r>
+          </w:p>
+        </w:tc>
+      </w:tr>
+      <w:tr>
+        <w:tc>
+          <w:tcPr>
+            <w:tcW w:type="dxa" w:w="4536"/>
+            <w:tcMar>
+              <w:top w:w="50" w:type="dxa"/>
+              <w:bottom w:w="50" w:type="dxa"/>
+              <w:start w:w="80" w:type="dxa"/>
+              <w:end w:w="80" w:type="dxa"/>
+            </w:tcMar>
+            <w:vAlign w:val="center"/>
+          </w:tcPr>
+          <w:p>
+            <w:r/>
+            <w:r>
+              <w:rPr>
+                <w:rFonts w:ascii="Arial" w:hAnsi="Arial"/>
+                <w:b w:val="0"/>
+                <w:i w:val="0"/>
+                <w:color w:val="000000"/>
+                <w:sz w:val="18"/>
+              </w:rPr>
+              <w:t>**Final client deliverable**</w:t>
+            </w:r>
+          </w:p>
+        </w:tc>
+        <w:tc>
+          <w:tcPr>
+            <w:tcW w:type="dxa" w:w="4536"/>
+            <w:tcMar>
+              <w:top w:w="50" w:type="dxa"/>
+              <w:bottom w:w="50" w:type="dxa"/>
+              <w:start w:w="80" w:type="dxa"/>
+              <w:end w:w="80" w:type="dxa"/>
+            </w:tcMar>
+            <w:vAlign w:val="center"/>
+          </w:tcPr>
+          <w:p>
+            <w:r/>
+            <w:r>
+              <w:rPr>
+                <w:rFonts w:ascii="Arial" w:hAnsi="Arial"/>
+                <w:b w:val="0"/>
+                <w:i w:val="0"/>
+                <w:color w:val="000000"/>
+                <w:sz w:val="18"/>
+              </w:rPr>
+              <w:t>`&lt;customer&gt;/` proper — only after Joerg confirms "ship it"</w:t>
+            </w:r>
+          </w:p>
+        </w:tc>
+      </w:tr>
+    </w:tbl>
+    <w:p/>
+    <w:p>
+      <w:r>
+        <w:rPr>
+          <w:rFonts w:ascii="Arial" w:hAnsi="Arial"/>
+          <w:b w:val="0"/>
+          <w:i w:val="0"/>
+          <w:color w:val="000000"/>
+          <w:sz w:val="20"/>
+        </w:rPr>
+        <w:t>Never create an `AI-INFO` folder manually — always use the bootstrap script so the registry stays in sync.</w:t>
+      </w:r>
+    </w:p>
+    <w:p>
+      <w:pPr>
+        <w:pStyle w:val="Heading2"/>
+      </w:pPr>
+      <w:r>
+        <w:rPr>
+          <w:rFonts w:ascii="Arial" w:hAnsi="Arial"/>
+          <w:color w:val="005A6C"/>
+          <w:sz w:val="28"/>
+        </w:rPr>
+        <w:t>Updating to the latest version</w:t>
+      </w:r>
+    </w:p>
+    <w:p>
+      <w:r>
+        <w:rPr>
+          <w:rFonts w:ascii="Arial" w:hAnsi="Arial"/>
+          <w:b w:val="0"/>
+          <w:i w:val="0"/>
+          <w:color w:val="000000"/>
+          <w:sz w:val="20"/>
+        </w:rPr>
+        <w:t xml:space="preserve">The framework and agents are under active development. To pull the latest version of everything — framework, all agents, KB scripts, and conventions — run </w:t>
+      </w:r>
+      <w:r>
+        <w:rPr>
+          <w:rFonts w:ascii="Arial" w:hAnsi="Arial"/>
+          <w:b/>
+          <w:i w:val="0"/>
+          <w:color w:val="000000"/>
+          <w:sz w:val="20"/>
+        </w:rPr>
+        <w:t>one command</w:t>
+      </w:r>
+      <w:r>
+        <w:rPr>
+          <w:rFonts w:ascii="Arial" w:hAnsi="Arial"/>
+          <w:b w:val="0"/>
+          <w:i w:val="0"/>
+          <w:color w:val="000000"/>
+          <w:sz w:val="20"/>
+        </w:rPr>
+        <w:t>:</w:t>
+      </w:r>
+    </w:p>
+    <w:p>
+      <w:pPr>
+        <w:pStyle w:val="Heading3"/>
+      </w:pPr>
+      <w:r>
+        <w:rPr>
+          <w:rFonts w:ascii="Arial" w:hAnsi="Arial"/>
+          <w:color w:val="25415C"/>
+          <w:sz w:val="24"/>
+        </w:rPr>
+        <w:t>On Mac</w:t>
+      </w:r>
+    </w:p>
+    <w:p>
+      <w:pPr>
+        <w:spacing w:before="120" w:after="120"/>
+        <w:ind w:left="567"/>
+        <w:shd w:val="clear" w:color="auto" w:fill="E9EDF0"/>
+      </w:pPr>
+      <w:r>
+        <w:rPr>
+          <w:rFonts w:ascii="Courier New" w:hAnsi="Courier New"/>
+          <w:color w:val="25415C"/>
+          <w:sz w:val="16"/>
+        </w:rPr>
+        <w:t>~/AI-Vault/ttc-agent-framework/scripts/update-all.sh</w:t>
+      </w:r>
+    </w:p>
+    <w:p>
+      <w:pPr>
+        <w:pStyle w:val="Heading3"/>
+      </w:pPr>
+      <w:r>
+        <w:rPr>
+          <w:rFonts w:ascii="Arial" w:hAnsi="Arial"/>
+          <w:color w:val="25415C"/>
+          <w:sz w:val="24"/>
+        </w:rPr>
+        <w:t>On Windows</w:t>
+      </w:r>
+    </w:p>
+    <w:p>
+      <w:pPr>
+        <w:spacing w:before="120" w:after="120"/>
+        <w:ind w:left="567"/>
+        <w:shd w:val="clear" w:color="auto" w:fill="E9EDF0"/>
+      </w:pPr>
+      <w:r>
+        <w:rPr>
+          <w:rFonts w:ascii="Courier New" w:hAnsi="Courier New"/>
+          <w:color w:val="25415C"/>
+          <w:sz w:val="16"/>
+        </w:rPr>
+        <w:t>&amp; "$env:USERPROFILE\AI-Vault\ttc-agent-framework\scripts\update-all.sh"</w:t>
+      </w:r>
+    </w:p>
+    <w:p>
+      <w:r>
+        <w:rPr>
+          <w:rFonts w:ascii="Arial" w:hAnsi="Arial"/>
+          <w:b w:val="0"/>
+          <w:i w:val="0"/>
+          <w:color w:val="000000"/>
+          <w:sz w:val="20"/>
+        </w:rPr>
+      </w:r>
+      <w:r>
+        <w:rPr>
+          <w:rFonts w:ascii="Arial" w:hAnsi="Arial"/>
+          <w:b w:val="0"/>
+          <w:i/>
+          <w:color w:val="000000"/>
+          <w:sz w:val="20"/>
+        </w:rPr>
+        <w:t>(Windows support via Git Bash; a native `update-all.ps1` may be added later.)</w:t>
+      </w:r>
+      <w:r>
+        <w:rPr>
+          <w:rFonts w:ascii="Arial" w:hAnsi="Arial"/>
+          <w:b w:val="0"/>
+          <w:i w:val="0"/>
+          <w:color w:val="000000"/>
+          <w:sz w:val="20"/>
+        </w:rPr>
+      </w:r>
+    </w:p>
+    <w:p>
+      <w:r>
+        <w:rPr>
+          <w:rFonts w:ascii="Arial" w:hAnsi="Arial"/>
+          <w:b w:val="0"/>
+          <w:i w:val="0"/>
+          <w:color w:val="000000"/>
+          <w:sz w:val="20"/>
+        </w:rPr>
+        <w:t>What it does:</w:t>
+      </w:r>
+    </w:p>
+    <w:p>
+      <w:pPr>
+        <w:pStyle w:val="ListBullet"/>
+      </w:pPr>
+      <w:r>
+        <w:rPr>
+          <w:rFonts w:ascii="Arial" w:hAnsi="Arial"/>
+          <w:b w:val="0"/>
+          <w:i w:val="0"/>
+          <w:color w:val="000000"/>
+          <w:sz w:val="20"/>
+        </w:rPr>
+        <w:t>Pulls the framework repo</w:t>
+      </w:r>
+    </w:p>
+    <w:p>
+      <w:pPr>
+        <w:pStyle w:val="ListBullet"/>
+      </w:pPr>
+      <w:r>
+        <w:rPr>
+          <w:rFonts w:ascii="Arial" w:hAnsi="Arial"/>
+          <w:b w:val="0"/>
+          <w:i w:val="0"/>
+          <w:color w:val="000000"/>
+          <w:sz w:val="20"/>
+        </w:rPr>
+        <w:t>Pulls every agent repo you have installed (fast-forward only)</w:t>
+      </w:r>
+    </w:p>
+    <w:p>
+      <w:pPr>
+        <w:pStyle w:val="ListBullet"/>
+      </w:pPr>
+      <w:r>
+        <w:rPr>
+          <w:rFonts w:ascii="Arial" w:hAnsi="Arial"/>
+          <w:b w:val="0"/>
+          <w:i w:val="0"/>
+          <w:color w:val="000000"/>
+          <w:sz w:val="20"/>
+        </w:rPr>
+      </w:r>
+      <w:r>
+        <w:rPr>
+          <w:rFonts w:ascii="Arial" w:hAnsi="Arial"/>
+          <w:b/>
+          <w:i w:val="0"/>
+          <w:color w:val="000000"/>
+          <w:sz w:val="20"/>
+        </w:rPr>
+        <w:t>Skips any repo with uncommitted local changes</w:t>
+      </w:r>
+      <w:r>
+        <w:rPr>
+          <w:rFonts w:ascii="Arial" w:hAnsi="Arial"/>
+          <w:b w:val="0"/>
+          <w:i w:val="0"/>
+          <w:color w:val="000000"/>
+          <w:sz w:val="20"/>
+        </w:rPr>
+        <w:t xml:space="preserve"> (safe — nothing overwritten)</w:t>
+      </w:r>
+    </w:p>
+    <w:p>
+      <w:pPr>
+        <w:pStyle w:val="ListBullet"/>
+      </w:pPr>
+      <w:r>
+        <w:rPr>
+          <w:rFonts w:ascii="Arial" w:hAnsi="Arial"/>
+          <w:b w:val="0"/>
+          <w:i w:val="0"/>
+          <w:color w:val="000000"/>
+          <w:sz w:val="20"/>
+        </w:rPr>
+        <w:t>Refreshes the runtime KB scripts (`kb_bootstrap_customer.sh`, `kb_refresh_customer.sh`, the converter, the vectorizer) and `KB_CONVENTIONS.md`</w:t>
+      </w:r>
+    </w:p>
+    <w:p>
+      <w:r>
+        <w:rPr>
+          <w:rFonts w:ascii="Arial" w:hAnsi="Arial"/>
+          <w:b w:val="0"/>
+          <w:i w:val="0"/>
+          <w:color w:val="000000"/>
+          <w:sz w:val="20"/>
+        </w:rPr>
+        <w:t xml:space="preserve">System-prompt changes take effect in your </w:t>
+      </w:r>
+      <w:r>
+        <w:rPr>
+          <w:rFonts w:ascii="Arial" w:hAnsi="Arial"/>
+          <w:b/>
+          <w:i w:val="0"/>
+          <w:color w:val="000000"/>
+          <w:sz w:val="20"/>
+        </w:rPr>
+        <w:t>next</w:t>
+      </w:r>
+      <w:r>
+        <w:rPr>
+          <w:rFonts w:ascii="Arial" w:hAnsi="Arial"/>
+          <w:b w:val="0"/>
+          <w:i w:val="0"/>
+          <w:color w:val="000000"/>
+          <w:sz w:val="20"/>
+        </w:rPr>
+        <w:t xml:space="preserve"> Claude Code conversation. No reload or restart needed.</w:t>
+      </w:r>
+    </w:p>
+    <w:p>
+      <w:r>
+        <w:rPr>
+          <w:rFonts w:ascii="Arial" w:hAnsi="Arial"/>
+          <w:b w:val="0"/>
+          <w:i w:val="0"/>
+          <w:color w:val="000000"/>
+          <w:sz w:val="20"/>
+        </w:rPr>
+        <w:t>When to run it:</w:t>
+      </w:r>
+    </w:p>
+    <w:p>
+      <w:pPr>
+        <w:pStyle w:val="ListBullet"/>
+      </w:pPr>
+      <w:r>
+        <w:rPr>
+          <w:rFonts w:ascii="Arial" w:hAnsi="Arial"/>
+          <w:b w:val="0"/>
+          <w:i w:val="0"/>
+          <w:color w:val="000000"/>
+          <w:sz w:val="20"/>
+        </w:rPr>
+        <w:t>When Joerg says "I pushed an update"</w:t>
+      </w:r>
+    </w:p>
+    <w:p>
+      <w:pPr>
+        <w:pStyle w:val="ListBullet"/>
+      </w:pPr>
+      <w:r>
+        <w:rPr>
+          <w:rFonts w:ascii="Arial" w:hAnsi="Arial"/>
+          <w:b w:val="0"/>
+          <w:i w:val="0"/>
+          <w:color w:val="000000"/>
+          <w:sz w:val="20"/>
+        </w:rPr>
+        <w:t>Once a week to stay current</w:t>
+      </w:r>
+    </w:p>
+    <w:p>
+      <w:pPr>
+        <w:pStyle w:val="ListBullet"/>
+      </w:pPr>
+      <w:r>
+        <w:rPr>
+          <w:rFonts w:ascii="Arial" w:hAnsi="Arial"/>
+          <w:b w:val="0"/>
+          <w:i w:val="0"/>
+          <w:color w:val="000000"/>
+          <w:sz w:val="20"/>
+        </w:rPr>
+        <w:t>Before starting a big customer engagement</w:t>
+      </w:r>
+    </w:p>
+    <w:p>
+      <w:r>
+        <w:rPr>
+          <w:rFonts w:ascii="Arial" w:hAnsi="Arial"/>
+          <w:b w:val="0"/>
+          <w:i w:val="0"/>
+          <w:color w:val="000000"/>
+          <w:sz w:val="20"/>
+        </w:rPr>
+        <w:t xml:space="preserve">When </w:t>
+      </w:r>
+      <w:r>
+        <w:rPr>
+          <w:rFonts w:ascii="Arial" w:hAnsi="Arial"/>
+          <w:b/>
+          <w:i w:val="0"/>
+          <w:color w:val="000000"/>
+          <w:sz w:val="20"/>
+        </w:rPr>
+        <w:t>not</w:t>
+      </w:r>
+      <w:r>
+        <w:rPr>
+          <w:rFonts w:ascii="Arial" w:hAnsi="Arial"/>
+          <w:b w:val="0"/>
+          <w:i w:val="0"/>
+          <w:color w:val="000000"/>
+          <w:sz w:val="20"/>
+        </w:rPr>
+        <w:t xml:space="preserve"> to run it (use the one-line installer from Step 4 instead):</w:t>
+      </w:r>
+    </w:p>
+    <w:p>
+      <w:pPr>
+        <w:pStyle w:val="ListBullet"/>
+      </w:pPr>
+      <w:r>
+        <w:rPr>
+          <w:rFonts w:ascii="Arial" w:hAnsi="Arial"/>
+          <w:b w:val="0"/>
+          <w:i w:val="0"/>
+          <w:color w:val="000000"/>
+          <w:sz w:val="20"/>
+        </w:rPr>
+        <w:t>First install on a new machine</w:t>
+      </w:r>
+    </w:p>
+    <w:p>
+      <w:pPr>
+        <w:pStyle w:val="ListBullet"/>
+      </w:pPr>
+      <w:r>
+        <w:rPr>
+          <w:rFonts w:ascii="Arial" w:hAnsi="Arial"/>
+          <w:b w:val="0"/>
+          <w:i w:val="0"/>
+          <w:color w:val="000000"/>
+          <w:sz w:val="20"/>
+        </w:rPr>
+        <w:t>When a new tool or Python dependency has been added (rare — usually mentioned in release notes)</w:t>
       </w:r>
     </w:p>
     <w:p>

</xml_diff>

<commit_message>
feat(kb): add kb_discover_customers — auto-discovery at session start
Scans OneDrive for AI-INFO folders and upserts missing ones into the
local customer registry. Called automatically at the start of every
customer-facing agent session (--quiet mode; silent unless changes).

Closes the Day-2-colleague gap: when User A creates a new customer KB,
User B sees it automatically next time they open the agent — no manual
registry edit needed.

Co-Authored-By: Claude Opus 4.7 (1M context) <noreply@anthropic.com>
</commit_message>
<xml_diff>
--- a/docs/TTC-Agent-Install-Manual.docx
+++ b/docs/TTC-Agent-Install-Manual.docx
@@ -6951,7 +6951,7 @@
           <w:color w:val="25415C"/>
           <w:sz w:val="24"/>
         </w:rPr>
-        <w:t>Working with a new customer</w:t>
+        <w:t>Working with a customer — three scenarios</w:t>
       </w:r>
     </w:p>
     <w:p>
@@ -6963,7 +6963,77 @@
           <w:color w:val="000000"/>
           <w:sz w:val="20"/>
         </w:rPr>
-        <w:t>When you start on a customer the framework hasn't seen before, the agent will run one command:</w:t>
+      </w:r>
+      <w:r>
+        <w:rPr>
+          <w:rFonts w:ascii="Arial" w:hAnsi="Arial"/>
+          <w:b/>
+          <w:i w:val="0"/>
+          <w:color w:val="000000"/>
+          <w:sz w:val="20"/>
+        </w:rPr>
+        <w:t>Scenario 1 — A colleague already has a KB for this customer</w:t>
+      </w:r>
+      <w:r>
+        <w:rPr>
+          <w:rFonts w:ascii="Arial" w:hAnsi="Arial"/>
+          <w:b w:val="0"/>
+          <w:i w:val="0"/>
+          <w:color w:val="000000"/>
+          <w:sz w:val="20"/>
+        </w:rPr>
+        <w:t xml:space="preserve"> Nothing special to do. Every customer-facing agent runs a </w:t>
+      </w:r>
+      <w:r>
+        <w:rPr>
+          <w:rFonts w:ascii="Arial" w:hAnsi="Arial"/>
+          <w:b/>
+          <w:i w:val="0"/>
+          <w:color w:val="000000"/>
+          <w:sz w:val="20"/>
+        </w:rPr>
+        <w:t>silent discovery</w:t>
+      </w:r>
+      <w:r>
+        <w:rPr>
+          <w:rFonts w:ascii="Arial" w:hAnsi="Arial"/>
+          <w:b w:val="0"/>
+          <w:i w:val="0"/>
+          <w:color w:val="000000"/>
+          <w:sz w:val="20"/>
+        </w:rPr>
+        <w:t xml:space="preserve"> at session start that scans OneDrive for `AI-INFO - DO NOT DELETE/` folders and adds any new ones to your local registry. Next time you say "apply tender" and mention that customer, the agent already knows the KB exists.</w:t>
+      </w:r>
+    </w:p>
+    <w:p>
+      <w:r>
+        <w:rPr>
+          <w:rFonts w:ascii="Arial" w:hAnsi="Arial"/>
+          <w:b w:val="0"/>
+          <w:i w:val="0"/>
+          <w:color w:val="000000"/>
+          <w:sz w:val="20"/>
+        </w:rPr>
+      </w:r>
+      <w:r>
+        <w:rPr>
+          <w:rFonts w:ascii="Arial" w:hAnsi="Arial"/>
+          <w:b/>
+          <w:i w:val="0"/>
+          <w:color w:val="000000"/>
+          <w:sz w:val="20"/>
+        </w:rPr>
+        <w:t>Scenario 2 — You're the first person working on a brand-new customer</w:t>
+      </w:r>
+      <w:r>
+        <w:rPr>
+          <w:rFonts w:ascii="Arial" w:hAnsi="Arial"/>
+          <w:b w:val="0"/>
+          <w:i w:val="0"/>
+          <w:color w:val="000000"/>
+          <w:sz w:val="20"/>
+        </w:rPr>
+        <w:t xml:space="preserve"> When you ask the agent to save something for a customer it doesn't recognise, it will run:</w:t>
       </w:r>
     </w:p>
     <w:p>
@@ -6990,7 +7060,7 @@
           <w:color w:val="000000"/>
           <w:sz w:val="20"/>
         </w:rPr>
-        <w:t>This creates the hidden `AI-INFO - DO NOT DELETE/` folder inside their OneDrive customer folder, seeds `README.md`, `notes.md`, `memory.md`, and adds the customer to the registry. It's idempotent — running it again is safe.</w:t>
+        <w:t>This creates the hidden `AI-INFO - DO NOT DELETE/` folder inside their OneDrive customer folder, seeds `README.md`, `notes.md`, `memory.md`, adds the customer to the registry, and applies the hidden flag. It's idempotent — running it again is safe.</w:t>
       </w:r>
     </w:p>
     <w:p>
@@ -7002,7 +7072,26 @@
           <w:color w:val="000000"/>
           <w:sz w:val="20"/>
         </w:rPr>
-        <w:t>To rebuild the searchable index (e.g. after new proposals were added):</w:t>
+      </w:r>
+      <w:r>
+        <w:rPr>
+          <w:rFonts w:ascii="Arial" w:hAnsi="Arial"/>
+          <w:b/>
+          <w:i w:val="0"/>
+          <w:color w:val="000000"/>
+          <w:sz w:val="20"/>
+        </w:rPr>
+        <w:t>Scenario 3 — Someone added new documents to a customer folder</w:t>
+      </w:r>
+      <w:r>
+        <w:rPr>
+          <w:rFonts w:ascii="Arial" w:hAnsi="Arial"/>
+          <w:b w:val="0"/>
+          <w:i w:val="0"/>
+          <w:color w:val="000000"/>
+          <w:sz w:val="20"/>
+        </w:rPr>
+        <w:t xml:space="preserve"> Rebuild the searchable index:</w:t>
       </w:r>
     </w:p>
     <w:p>
@@ -7018,6 +7107,18 @@
           <w:sz w:val="16"/>
         </w:rPr>
         <w:t>~/AI-Vault/Claude\ Folder/kb_refresh_customer.sh "Customer Name"</w:t>
+      </w:r>
+    </w:p>
+    <w:p>
+      <w:r>
+        <w:rPr>
+          <w:rFonts w:ascii="Arial" w:hAnsi="Arial"/>
+          <w:b w:val="0"/>
+          <w:i w:val="0"/>
+          <w:color w:val="000000"/>
+          <w:sz w:val="20"/>
+        </w:rPr>
+        <w:t>This re-converts only the new/changed source docs and updates your local vector index. Takes seconds.</w:t>
       </w:r>
     </w:p>
     <w:p>

</xml_diff>

<commit_message>
docs(manual): add 'Activate your Claude account' as Step 1
The account activation (via the Anthropic invite email) must happen
before any other step. Added new Step 1 with instructions, renumbered
remaining steps 2–7, and updated all cross-references (7 steps total
now).

Covers the three common edge cases: expired invite, pre-existing
personal account, and the "asks you to pay" signal that the workspace
link hasn't happened yet.

Co-Authored-By: Claude Opus 4.7 (1M context) <noreply@anthropic.com>
</commit_message>
<xml_diff>
--- a/docs/TTC-Agent-Install-Manual.docx
+++ b/docs/TTC-Agent-Install-Manual.docx
@@ -374,7 +374,7 @@
           <w:color w:val="005A6C"/>
           <w:sz w:val="28"/>
         </w:rPr>
-        <w:t>The 6 steps (recommended order)</w:t>
+        <w:t>The 7 steps (recommended order)</w:t>
       </w:r>
     </w:p>
     <w:p>
@@ -398,7 +398,7 @@
           <w:color w:val="000000"/>
           <w:sz w:val="20"/>
         </w:rPr>
-        <w:t>Create a GitHub account</w:t>
+        <w:t>Activate your Claude account</w:t>
       </w:r>
       <w:r>
         <w:rPr>
@@ -408,7 +408,7 @@
           <w:color w:val="000000"/>
           <w:sz w:val="20"/>
         </w:rPr>
-        <w:t xml:space="preserve"> (if you do not already have one)</w:t>
+        <w:t xml:space="preserve"> — follow the invite email Joerg sent you</w:t>
       </w:r>
     </w:p>
     <w:p>
@@ -432,7 +432,7 @@
           <w:color w:val="000000"/>
           <w:sz w:val="20"/>
         </w:rPr>
-        <w:t>Send Joerg your GitHub username</w:t>
+        <w:t>Create a GitHub account</w:t>
       </w:r>
       <w:r>
         <w:rPr>
@@ -442,7 +442,7 @@
           <w:color w:val="000000"/>
           <w:sz w:val="20"/>
         </w:rPr>
-        <w:t xml:space="preserve"> so he can grant you access to the right agents</w:t>
+        <w:t xml:space="preserve"> (if you do not already have one)</w:t>
       </w:r>
     </w:p>
     <w:p>
@@ -466,7 +466,7 @@
           <w:color w:val="000000"/>
           <w:sz w:val="20"/>
         </w:rPr>
-        <w:t>Install Claude Desktop</w:t>
+        <w:t>Send Joerg your GitHub username</w:t>
       </w:r>
       <w:r>
         <w:rPr>
@@ -476,7 +476,7 @@
           <w:color w:val="000000"/>
           <w:sz w:val="20"/>
         </w:rPr>
-        <w:t xml:space="preserve"> (highly recommended — the easier UI, and what you will use to let Claude control your local tools)</w:t>
+        <w:t xml:space="preserve"> so he can grant you access to the right agents</w:t>
       </w:r>
     </w:p>
     <w:p>
@@ -500,7 +500,7 @@
           <w:color w:val="000000"/>
           <w:sz w:val="20"/>
         </w:rPr>
-        <w:t>Run the one-line TTC installer</w:t>
+        <w:t>Install Claude Desktop</w:t>
       </w:r>
       <w:r>
         <w:rPr>
@@ -510,7 +510,7 @@
           <w:color w:val="000000"/>
           <w:sz w:val="20"/>
         </w:rPr>
-        <w:t xml:space="preserve"> — this installs everything else automatically</w:t>
+        <w:t xml:space="preserve"> (highly recommended — the easier UI, and what you will use to let Claude control your local tools)</w:t>
       </w:r>
     </w:p>
     <w:p>
@@ -534,7 +534,7 @@
           <w:color w:val="000000"/>
           <w:sz w:val="20"/>
         </w:rPr>
-        <w:t>Start Claude Code and try an agent</w:t>
+        <w:t>Run the one-line TTC installer</w:t>
       </w:r>
       <w:r>
         <w:rPr>
@@ -544,6 +544,7 @@
           <w:color w:val="000000"/>
           <w:sz w:val="20"/>
         </w:rPr>
+        <w:t xml:space="preserve"> — this installs everything else automatically</w:t>
       </w:r>
     </w:p>
     <w:p>
@@ -567,7 +568,7 @@
           <w:color w:val="000000"/>
           <w:sz w:val="20"/>
         </w:rPr>
-        <w:t>Set up 1Password and your Claude Desktop connectors</w:t>
+        <w:t>Start Claude Code and try an agent</w:t>
       </w:r>
       <w:r>
         <w:rPr>
@@ -577,10 +578,12 @@
           <w:color w:val="000000"/>
           <w:sz w:val="20"/>
         </w:rPr>
-        <w:t xml:space="preserve"> (recommended)</w:t>
       </w:r>
     </w:p>
     <w:p>
+      <w:pPr>
+        <w:pStyle w:val="ListNumber"/>
+      </w:pPr>
       <w:r>
         <w:rPr>
           <w:rFonts w:ascii="Arial" w:hAnsi="Arial"/>
@@ -589,7 +592,38 @@
           <w:color w:val="000000"/>
           <w:sz w:val="20"/>
         </w:rPr>
-        <w:t>Do them in this order. If you run the installer before step 2 is done, it will fail at the GitHub login step.</w:t>
+      </w:r>
+      <w:r>
+        <w:rPr>
+          <w:rFonts w:ascii="Arial" w:hAnsi="Arial"/>
+          <w:b/>
+          <w:i w:val="0"/>
+          <w:color w:val="000000"/>
+          <w:sz w:val="20"/>
+        </w:rPr>
+        <w:t>Set up 1Password and your Claude Desktop connectors</w:t>
+      </w:r>
+      <w:r>
+        <w:rPr>
+          <w:rFonts w:ascii="Arial" w:hAnsi="Arial"/>
+          <w:b w:val="0"/>
+          <w:i w:val="0"/>
+          <w:color w:val="000000"/>
+          <w:sz w:val="20"/>
+        </w:rPr>
+        <w:t xml:space="preserve"> (recommended)</w:t>
+      </w:r>
+    </w:p>
+    <w:p>
+      <w:r>
+        <w:rPr>
+          <w:rFonts w:ascii="Arial" w:hAnsi="Arial"/>
+          <w:b w:val="0"/>
+          <w:i w:val="0"/>
+          <w:color w:val="000000"/>
+          <w:sz w:val="20"/>
+        </w:rPr>
+        <w:t>Do them in this order. If you run the installer before step 3 is done, it will fail at the GitHub login step.</w:t>
       </w:r>
     </w:p>
     <w:p>
@@ -602,7 +636,7 @@
           <w:color w:val="005A6C"/>
           <w:sz w:val="28"/>
         </w:rPr>
-        <w:t>Step 1 — Create a GitHub account</w:t>
+        <w:t>Step 1 — Activate your Claude account</w:t>
       </w:r>
     </w:p>
     <w:p>
@@ -614,7 +648,27 @@
           <w:color w:val="000000"/>
           <w:sz w:val="20"/>
         </w:rPr>
-        <w:t>GitHub is where the TTC agents are stored. You need a (free) personal GitHub account to download them.</w:t>
+        <w:t xml:space="preserve">Before you can use the agents, your Anthropic (Claude) account must be active. Joerg sends each TTC colleague an </w:t>
+      </w:r>
+      <w:r>
+        <w:rPr>
+          <w:rFonts w:ascii="Arial" w:hAnsi="Arial"/>
+          <w:b/>
+          <w:i w:val="0"/>
+          <w:color w:val="000000"/>
+          <w:sz w:val="20"/>
+        </w:rPr>
+        <w:t>invitation email from Anthropic</w:t>
+      </w:r>
+      <w:r>
+        <w:rPr>
+          <w:rFonts w:ascii="Arial" w:hAnsi="Arial"/>
+          <w:b w:val="0"/>
+          <w:i w:val="0"/>
+          <w:color w:val="000000"/>
+          <w:sz w:val="20"/>
+        </w:rPr>
+        <w:t xml:space="preserve"> when onboarding — it contains a personal activation link.</w:t>
       </w:r>
     </w:p>
     <w:p>
@@ -629,26 +683,7 @@
           <w:color w:val="000000"/>
           <w:sz w:val="20"/>
         </w:rPr>
-        <w:t xml:space="preserve">Go to </w:t>
-      </w:r>
-      <w:r>
-        <w:rPr>
-          <w:rFonts w:ascii="Arial" w:hAnsi="Arial"/>
-          <w:b/>
-          <w:i w:val="0"/>
-          <w:color w:val="000000"/>
-          <w:sz w:val="20"/>
-        </w:rPr>
-        <w:t>https://github.com/signup</w:t>
-      </w:r>
-      <w:r>
-        <w:rPr>
-          <w:rFonts w:ascii="Arial" w:hAnsi="Arial"/>
-          <w:b w:val="0"/>
-          <w:i w:val="0"/>
-          <w:color w:val="000000"/>
-          <w:sz w:val="20"/>
-        </w:rPr>
+        <w:t>Open the invitation email with the subject line *"You've been invited to join TTC on Claude"* (or similar). Check your Junk / Clutter folder if you don't see it — Anthropic emails sometimes land there.</w:t>
       </w:r>
     </w:p>
     <w:p>
@@ -663,7 +698,7 @@
           <w:color w:val="000000"/>
           <w:sz w:val="20"/>
         </w:rPr>
-        <w:t xml:space="preserve">Use </w:t>
+        <w:t xml:space="preserve">Click the </w:t>
       </w:r>
       <w:r>
         <w:rPr>
@@ -673,7 +708,7 @@
           <w:color w:val="000000"/>
           <w:sz w:val="20"/>
         </w:rPr>
-        <w:t>your TTC work email</w:t>
+        <w:t>Accept invitation</w:t>
       </w:r>
       <w:r>
         <w:rPr>
@@ -683,7 +718,7 @@
           <w:color w:val="000000"/>
           <w:sz w:val="20"/>
         </w:rPr>
-        <w:t xml:space="preserve"> as the account email.</w:t>
+        <w:t xml:space="preserve"> button in the email. It takes you to claude.ai.</w:t>
       </w:r>
     </w:p>
     <w:p>
@@ -698,7 +733,26 @@
           <w:color w:val="000000"/>
           <w:sz w:val="20"/>
         </w:rPr>
-        <w:t>Pick a username. Something simple like `firstname-lastname-ttc` works well.</w:t>
+      </w:r>
+      <w:r>
+        <w:rPr>
+          <w:rFonts w:ascii="Arial" w:hAnsi="Arial"/>
+          <w:b/>
+          <w:i w:val="0"/>
+          <w:color w:val="000000"/>
+          <w:sz w:val="20"/>
+        </w:rPr>
+        <w:t>Create or sign in to your Anthropic account</w:t>
+      </w:r>
+      <w:r>
+        <w:rPr>
+          <w:rFonts w:ascii="Arial" w:hAnsi="Arial"/>
+          <w:b w:val="0"/>
+          <w:i w:val="0"/>
+          <w:color w:val="000000"/>
+          <w:sz w:val="20"/>
+        </w:rPr>
+        <w:t xml:space="preserve"> using your TTC work email address. If you already have a personal Anthropic account on your work email, it will link; otherwise create a new one and set a password.</w:t>
       </w:r>
     </w:p>
     <w:p>
@@ -713,27 +767,7 @@
           <w:color w:val="000000"/>
           <w:sz w:val="20"/>
         </w:rPr>
-        <w:t xml:space="preserve">Choose the </w:t>
-      </w:r>
-      <w:r>
-        <w:rPr>
-          <w:rFonts w:ascii="Arial" w:hAnsi="Arial"/>
-          <w:b/>
-          <w:i w:val="0"/>
-          <w:color w:val="000000"/>
-          <w:sz w:val="20"/>
-        </w:rPr>
-        <w:t>Free</w:t>
-      </w:r>
-      <w:r>
-        <w:rPr>
-          <w:rFonts w:ascii="Arial" w:hAnsi="Arial"/>
-          <w:b w:val="0"/>
-          <w:i w:val="0"/>
-          <w:color w:val="000000"/>
-          <w:sz w:val="20"/>
-        </w:rPr>
-        <w:t xml:space="preserve"> plan.</w:t>
+        <w:t>Accept the workspace invitation when prompted — you should now see "TTC" (or the TTC workspace name) in your account.</w:t>
       </w:r>
     </w:p>
     <w:p>
@@ -748,7 +782,27 @@
           <w:color w:val="000000"/>
           <w:sz w:val="20"/>
         </w:rPr>
-        <w:t>Verify your email address using the code GitHub sends you.</w:t>
+        <w:t xml:space="preserve">Try sending a test message at </w:t>
+      </w:r>
+      <w:r>
+        <w:rPr>
+          <w:rFonts w:ascii="Arial" w:hAnsi="Arial"/>
+          <w:b/>
+          <w:i w:val="0"/>
+          <w:color w:val="000000"/>
+          <w:sz w:val="20"/>
+        </w:rPr>
+        <w:t>https://claude.ai</w:t>
+      </w:r>
+      <w:r>
+        <w:rPr>
+          <w:rFonts w:ascii="Arial" w:hAnsi="Arial"/>
+          <w:b w:val="0"/>
+          <w:i w:val="0"/>
+          <w:color w:val="000000"/>
+          <w:sz w:val="20"/>
+        </w:rPr>
+        <w:t xml:space="preserve"> — if Claude replies, your account is active. Done.</w:t>
       </w:r>
     </w:p>
     <w:p>
@@ -760,7 +814,21 @@
           <w:color w:val="000000"/>
           <w:sz w:val="20"/>
         </w:rPr>
-        <w:t xml:space="preserve">You do </w:t>
+        <w:t>If:</w:t>
+      </w:r>
+    </w:p>
+    <w:p>
+      <w:pPr>
+        <w:pStyle w:val="ListBullet"/>
+      </w:pPr>
+      <w:r>
+        <w:rPr>
+          <w:rFonts w:ascii="Arial" w:hAnsi="Arial"/>
+          <w:b w:val="0"/>
+          <w:i w:val="0"/>
+          <w:color w:val="000000"/>
+          <w:sz w:val="20"/>
+        </w:rPr>
       </w:r>
       <w:r>
         <w:rPr>
@@ -770,7 +838,7 @@
           <w:color w:val="000000"/>
           <w:sz w:val="20"/>
         </w:rPr>
-        <w:t>not</w:t>
+        <w:t>The email expired</w:t>
       </w:r>
       <w:r>
         <w:rPr>
@@ -780,7 +848,87 @@
           <w:color w:val="000000"/>
           <w:sz w:val="20"/>
         </w:rPr>
-        <w:t xml:space="preserve"> need to create any repositories, add a profile picture, or anything else. Just get the account created.</w:t>
+        <w:t xml:space="preserve"> or you cannot find it → ask Joerg to resend.</w:t>
+      </w:r>
+    </w:p>
+    <w:p>
+      <w:pPr>
+        <w:pStyle w:val="ListBullet"/>
+      </w:pPr>
+      <w:r>
+        <w:rPr>
+          <w:rFonts w:ascii="Arial" w:hAnsi="Arial"/>
+          <w:b w:val="0"/>
+          <w:i w:val="0"/>
+          <w:color w:val="000000"/>
+          <w:sz w:val="20"/>
+        </w:rPr>
+      </w:r>
+      <w:r>
+        <w:rPr>
+          <w:rFonts w:ascii="Arial" w:hAnsi="Arial"/>
+          <w:b/>
+          <w:i w:val="0"/>
+          <w:color w:val="000000"/>
+          <w:sz w:val="20"/>
+        </w:rPr>
+        <w:t>You already had a personal Claude account</w:t>
+      </w:r>
+      <w:r>
+        <w:rPr>
+          <w:rFonts w:ascii="Arial" w:hAnsi="Arial"/>
+          <w:b w:val="0"/>
+          <w:i w:val="0"/>
+          <w:color w:val="000000"/>
+          <w:sz w:val="20"/>
+        </w:rPr>
+        <w:t xml:space="preserve"> on a different email → that's fine; the TTC invite will link your TTC workspace to the existing account. Use whichever email the invite was sent to.</w:t>
+      </w:r>
+    </w:p>
+    <w:p>
+      <w:pPr>
+        <w:pStyle w:val="ListBullet"/>
+      </w:pPr>
+      <w:r>
+        <w:rPr>
+          <w:rFonts w:ascii="Arial" w:hAnsi="Arial"/>
+          <w:b w:val="0"/>
+          <w:i w:val="0"/>
+          <w:color w:val="000000"/>
+          <w:sz w:val="20"/>
+        </w:rPr>
+      </w:r>
+      <w:r>
+        <w:rPr>
+          <w:rFonts w:ascii="Arial" w:hAnsi="Arial"/>
+          <w:b/>
+          <w:i w:val="0"/>
+          <w:color w:val="000000"/>
+          <w:sz w:val="20"/>
+        </w:rPr>
+        <w:t>Claude.ai asks you to pay</w:t>
+      </w:r>
+      <w:r>
+        <w:rPr>
+          <w:rFonts w:ascii="Arial" w:hAnsi="Arial"/>
+          <w:b w:val="0"/>
+          <w:i w:val="0"/>
+          <w:color w:val="000000"/>
+          <w:sz w:val="20"/>
+        </w:rPr>
+        <w:t xml:space="preserve"> → you are not yet in the TTC workspace; re-open the invite link or ask Joerg.</w:t>
+      </w:r>
+    </w:p>
+    <w:p>
+      <w:r>
+        <w:rPr>
+          <w:rFonts w:ascii="Arial" w:hAnsi="Arial"/>
+          <w:b w:val="0"/>
+          <w:i w:val="0"/>
+          <w:color w:val="000000"/>
+          <w:sz w:val="20"/>
+        </w:rPr>
+        <w:t>Once you can log into claude.ai and reply to a test prompt, carry on with step 2.</w:t>
       </w:r>
     </w:p>
     <w:p>
@@ -793,7 +941,198 @@
           <w:color w:val="005A6C"/>
           <w:sz w:val="28"/>
         </w:rPr>
-        <w:t>Step 2 — Send Joerg your GitHub username</w:t>
+        <w:t>Step 2 — Create a GitHub account</w:t>
+      </w:r>
+    </w:p>
+    <w:p>
+      <w:r>
+        <w:rPr>
+          <w:rFonts w:ascii="Arial" w:hAnsi="Arial"/>
+          <w:b w:val="0"/>
+          <w:i w:val="0"/>
+          <w:color w:val="000000"/>
+          <w:sz w:val="20"/>
+        </w:rPr>
+        <w:t>GitHub is where the TTC agents are stored. You need a (free) personal GitHub account to download them.</w:t>
+      </w:r>
+    </w:p>
+    <w:p>
+      <w:pPr>
+        <w:pStyle w:val="ListNumber"/>
+      </w:pPr>
+      <w:r>
+        <w:rPr>
+          <w:rFonts w:ascii="Arial" w:hAnsi="Arial"/>
+          <w:b w:val="0"/>
+          <w:i w:val="0"/>
+          <w:color w:val="000000"/>
+          <w:sz w:val="20"/>
+        </w:rPr>
+        <w:t xml:space="preserve">Go to </w:t>
+      </w:r>
+      <w:r>
+        <w:rPr>
+          <w:rFonts w:ascii="Arial" w:hAnsi="Arial"/>
+          <w:b/>
+          <w:i w:val="0"/>
+          <w:color w:val="000000"/>
+          <w:sz w:val="20"/>
+        </w:rPr>
+        <w:t>https://github.com/signup</w:t>
+      </w:r>
+      <w:r>
+        <w:rPr>
+          <w:rFonts w:ascii="Arial" w:hAnsi="Arial"/>
+          <w:b w:val="0"/>
+          <w:i w:val="0"/>
+          <w:color w:val="000000"/>
+          <w:sz w:val="20"/>
+        </w:rPr>
+      </w:r>
+    </w:p>
+    <w:p>
+      <w:pPr>
+        <w:pStyle w:val="ListNumber"/>
+      </w:pPr>
+      <w:r>
+        <w:rPr>
+          <w:rFonts w:ascii="Arial" w:hAnsi="Arial"/>
+          <w:b w:val="0"/>
+          <w:i w:val="0"/>
+          <w:color w:val="000000"/>
+          <w:sz w:val="20"/>
+        </w:rPr>
+        <w:t xml:space="preserve">Use </w:t>
+      </w:r>
+      <w:r>
+        <w:rPr>
+          <w:rFonts w:ascii="Arial" w:hAnsi="Arial"/>
+          <w:b/>
+          <w:i w:val="0"/>
+          <w:color w:val="000000"/>
+          <w:sz w:val="20"/>
+        </w:rPr>
+        <w:t>your TTC work email</w:t>
+      </w:r>
+      <w:r>
+        <w:rPr>
+          <w:rFonts w:ascii="Arial" w:hAnsi="Arial"/>
+          <w:b w:val="0"/>
+          <w:i w:val="0"/>
+          <w:color w:val="000000"/>
+          <w:sz w:val="20"/>
+        </w:rPr>
+        <w:t xml:space="preserve"> as the account email.</w:t>
+      </w:r>
+    </w:p>
+    <w:p>
+      <w:pPr>
+        <w:pStyle w:val="ListNumber"/>
+      </w:pPr>
+      <w:r>
+        <w:rPr>
+          <w:rFonts w:ascii="Arial" w:hAnsi="Arial"/>
+          <w:b w:val="0"/>
+          <w:i w:val="0"/>
+          <w:color w:val="000000"/>
+          <w:sz w:val="20"/>
+        </w:rPr>
+        <w:t>Pick a username. Something simple like `firstname-lastname-ttc` works well.</w:t>
+      </w:r>
+    </w:p>
+    <w:p>
+      <w:pPr>
+        <w:pStyle w:val="ListNumber"/>
+      </w:pPr>
+      <w:r>
+        <w:rPr>
+          <w:rFonts w:ascii="Arial" w:hAnsi="Arial"/>
+          <w:b w:val="0"/>
+          <w:i w:val="0"/>
+          <w:color w:val="000000"/>
+          <w:sz w:val="20"/>
+        </w:rPr>
+        <w:t xml:space="preserve">Choose the </w:t>
+      </w:r>
+      <w:r>
+        <w:rPr>
+          <w:rFonts w:ascii="Arial" w:hAnsi="Arial"/>
+          <w:b/>
+          <w:i w:val="0"/>
+          <w:color w:val="000000"/>
+          <w:sz w:val="20"/>
+        </w:rPr>
+        <w:t>Free</w:t>
+      </w:r>
+      <w:r>
+        <w:rPr>
+          <w:rFonts w:ascii="Arial" w:hAnsi="Arial"/>
+          <w:b w:val="0"/>
+          <w:i w:val="0"/>
+          <w:color w:val="000000"/>
+          <w:sz w:val="20"/>
+        </w:rPr>
+        <w:t xml:space="preserve"> plan.</w:t>
+      </w:r>
+    </w:p>
+    <w:p>
+      <w:pPr>
+        <w:pStyle w:val="ListNumber"/>
+      </w:pPr>
+      <w:r>
+        <w:rPr>
+          <w:rFonts w:ascii="Arial" w:hAnsi="Arial"/>
+          <w:b w:val="0"/>
+          <w:i w:val="0"/>
+          <w:color w:val="000000"/>
+          <w:sz w:val="20"/>
+        </w:rPr>
+        <w:t>Verify your email address using the code GitHub sends you.</w:t>
+      </w:r>
+    </w:p>
+    <w:p>
+      <w:r>
+        <w:rPr>
+          <w:rFonts w:ascii="Arial" w:hAnsi="Arial"/>
+          <w:b w:val="0"/>
+          <w:i w:val="0"/>
+          <w:color w:val="000000"/>
+          <w:sz w:val="20"/>
+        </w:rPr>
+        <w:t xml:space="preserve">You do </w:t>
+      </w:r>
+      <w:r>
+        <w:rPr>
+          <w:rFonts w:ascii="Arial" w:hAnsi="Arial"/>
+          <w:b/>
+          <w:i w:val="0"/>
+          <w:color w:val="000000"/>
+          <w:sz w:val="20"/>
+        </w:rPr>
+        <w:t>not</w:t>
+      </w:r>
+      <w:r>
+        <w:rPr>
+          <w:rFonts w:ascii="Arial" w:hAnsi="Arial"/>
+          <w:b w:val="0"/>
+          <w:i w:val="0"/>
+          <w:color w:val="000000"/>
+          <w:sz w:val="20"/>
+        </w:rPr>
+        <w:t xml:space="preserve"> need to create any repositories, add a profile picture, or anything else. Just get the account created.</w:t>
+      </w:r>
+    </w:p>
+    <w:p>
+      <w:pPr>
+        <w:pStyle w:val="Heading2"/>
+      </w:pPr>
+      <w:r>
+        <w:rPr>
+          <w:rFonts w:ascii="Arial" w:hAnsi="Arial"/>
+          <w:color w:val="005A6C"/>
+          <w:sz w:val="28"/>
+        </w:rPr>
+        <w:t>Step 3 — Send Joerg your GitHub username</w:t>
       </w:r>
     </w:p>
     <w:p>
@@ -859,7 +1198,7 @@
           <w:color w:val="000000"/>
           <w:sz w:val="20"/>
         </w:rPr>
-        <w:t>Only after you have accepted the invitation should you move on to step 4.</w:t>
+        <w:t>Only after you have accepted the invitation should you move on to step 5.</w:t>
       </w:r>
     </w:p>
     <w:p>
@@ -872,7 +1211,7 @@
           <w:color w:val="005A6C"/>
           <w:sz w:val="28"/>
         </w:rPr>
-        <w:t>Step 3 — Install Claude Desktop (highly recommended)</w:t>
+        <w:t>Step 4 — Install Claude Desktop (highly recommended)</w:t>
       </w:r>
     </w:p>
     <w:p>
@@ -956,7 +1295,7 @@
           <w:color w:val="000000"/>
           <w:sz w:val="20"/>
         </w:rPr>
-        <w:t xml:space="preserve"> where the TTC agents live (those run in Claude Code, step 4). But most TTC colleagues end up using both apps side by side, and Claude Desktop is the one you will open first thing in the morning.</w:t>
+        <w:t xml:space="preserve"> where the TTC agents live (those run in Claude Code, step 5). But most TTC colleagues end up using both apps side by side, and Claude Desktop is the one you will open first thing in the morning.</w:t>
       </w:r>
     </w:p>
     <w:p>
@@ -1036,7 +1375,7 @@
           <w:color w:val="000000"/>
           <w:sz w:val="20"/>
         </w:rPr>
-        <w:t>Sign in with your Anthropic account (the same one you will use in step 5 for Claude Code).</w:t>
+        <w:t>Sign in with the Anthropic account you activated in step 1 (same credentials you will use in step 6 for Claude Code).</w:t>
       </w:r>
     </w:p>
     <w:p>
@@ -1048,7 +1387,7 @@
           <w:color w:val="000000"/>
           <w:sz w:val="20"/>
         </w:rPr>
-        <w:t>Once signed in, come back here and carry on with step 4. We will add the useful extensions and connectors to Claude Desktop in step 6.</w:t>
+        <w:t>Once signed in, come back here and carry on with step 5. We will add the useful extensions and connectors to Claude Desktop in step 7.</w:t>
       </w:r>
     </w:p>
     <w:p>
@@ -1061,7 +1400,7 @@
           <w:color w:val="005A6C"/>
           <w:sz w:val="28"/>
         </w:rPr>
-        <w:t>Step 4 — Install the TTC Framework (one-line command)</w:t>
+        <w:t>Step 5 — Install the TTC Framework (one-line command)</w:t>
       </w:r>
     </w:p>
     <w:p>
@@ -1887,7 +2226,7 @@
           <w:color w:val="005A6C"/>
           <w:sz w:val="28"/>
         </w:rPr>
-        <w:t>Step 5 — Start Claude Code and try an agent</w:t>
+        <w:t>Step 6 — Start Claude Code and try an agent</w:t>
       </w:r>
     </w:p>
     <w:p>
@@ -2034,7 +2373,7 @@
           <w:color w:val="005A6C"/>
           <w:sz w:val="28"/>
         </w:rPr>
-        <w:t>Step 6 — Set up 1Password and Claude Desktop connectors</w:t>
+        <w:t>Step 7 — Set up 1Password and Claude Desktop connectors</w:t>
       </w:r>
     </w:p>
     <w:p>
@@ -2103,7 +2442,7 @@
           <w:color w:val="000000"/>
           <w:sz w:val="20"/>
         </w:rPr>
-        <w:t xml:space="preserve">The installer in step 4 already put the </w:t>
+        <w:t xml:space="preserve">The installer in step 5 already put the </w:t>
       </w:r>
       <w:r>
         <w:rPr>
@@ -2421,7 +2760,7 @@
           <w:color w:val="000000"/>
           <w:sz w:val="20"/>
         </w:rPr>
-        <w:t>Claude Desktop (the chat app from step 3) supports the same kind of integrations as Claude Code. Here is the setup used on the reference TTC laptop — you can mirror the whole thing or pick and choose.</w:t>
+        <w:t>Claude Desktop (the chat app from step 4) supports the same kind of integrations as Claude Code. Here is the setup used on the reference TTC laptop — you can mirror the whole thing or pick and choose.</w:t>
       </w:r>
     </w:p>
     <w:p>
@@ -7829,7 +8168,7 @@
           <w:color w:val="000000"/>
           <w:sz w:val="20"/>
         </w:rPr>
-        <w:t xml:space="preserve"> to run it (use the one-line installer from Step 4 instead):</w:t>
+        <w:t xml:space="preserve"> to run it (use the one-line installer from Step 5 instead):</w:t>
       </w:r>
     </w:p>
     <w:p>

</xml_diff>